<commit_message>
Compute estimated patent expiry; root-cause = env network allowlist
ROOT CAUSE: environment network policy allowlists only package/dev infra
(pypi/github/npm = 200); all patent hosts + USPTO/EPO APIs + even
api.github.com/wikipedia = 403 via Bash egress. Only harness WebSearch/
WebFetch pass, and among patent sites only FreePatentsOnline isn't
bot-blocked (and is intermittent). API keys cannot help (API hosts
proxy-blocked). True cross-source verification + authoritative legal
status are not achievable without a network-policy change.

FIXED WITHOUT NETWORK:
- estimated_expiry computed for 26 patents (priority/filing + 20y),
  clearly labeled estimate excluding PTA/PTE; report Appendix C added
- US11939361B2 base term est. 2040-11-20 (PTE up to +5y likely)
- docx regenerated + validated (1358 paragraphs)

STILL BLOCKED (needs env network policy change): WO2021146441 claims
168-186 (FPO truncates at 167, inconsistent), JP/CA claims, cross-source
diff, authoritative legal status/PTA/PTE.
</commit_message>
<xml_diff>
--- a/pcea-harness/output/patent_claims_report.docx
+++ b/pcea-harness/output/patent_claims_report.docx
@@ -24728,6 +24728,4110 @@
       </w:pPr>
       <w:r>
         <w:t xml:space="preserve">*보고서 생성일: 2026-06-15 · 출처: FreePatentsOnline 단일 소스(cross_source=false) · 청구항 원문은 verbatim 보존(번역·교정 없음).*</w:t>
+      </w:r>
+    </w:p>
+    <w:p>
+      <w:pPr>
+        <w:spacing w:after="60"/>
+      </w:pPr>
+    </w:p>
+    <w:p>
+      <w:pPr>
+        <w:pBdr>
+          <w:bottom w:val="single" w:color="2E75B6" w:sz="6" w:space="1"/>
+        </w:pBdr>
+        <w:spacing w:after="80"/>
+      </w:pPr>
+    </w:p>
+    <w:p>
+      <w:pPr>
+        <w:spacing w:after="60"/>
+      </w:pPr>
+    </w:p>
+    <w:p>
+      <w:pPr>
+        <w:pStyle w:val="Heading2"/>
+      </w:pPr>
+      <w:r>
+        <w:t xml:space="preserve">부록 C — 특허 만료일 추정 (계산값, 2026-06-15 추가)</w:t>
+      </w:r>
+    </w:p>
+    <w:p>
+      <w:pPr>
+        <w:spacing w:after="60"/>
+      </w:pPr>
+    </w:p>
+    <w:p>
+      <w:pPr>
+        <w:shd w:fill="FBF6E8" w:val="clear"/>
+        <w:ind w:left="480"/>
+      </w:pPr>
+      <w:r>
+        <w:rPr>
+          <w:i/>
+          <w:iCs/>
+        </w:rPr>
+        <w:t xml:space="preserve">⚠ </w:t>
+      </w:r>
+      <w:r>
+        <w:rPr>
+          <w:b/>
+          <w:bCs/>
+          <w:i/>
+          <w:iCs/>
+        </w:rPr>
+        <w:t xml:space="preserve">방법론·한계 고지(반드시 읽을 것):</w:t>
+      </w:r>
+      <w:r>
+        <w:rPr>
+          <w:i/>
+          <w:iCs/>
+        </w:rPr>
+        <w:t xml:space="preserve"> 아래 만료일은 권위 출처(USPTO/EPO 법적상태)에서 확인한 값이 </w:t>
+      </w:r>
+      <w:r>
+        <w:rPr>
+          <w:b/>
+          <w:bCs/>
+          <w:i/>
+          <w:iCs/>
+        </w:rPr>
+        <w:t xml:space="preserve">아니라</w:t>
+      </w:r>
+      <w:r>
+        <w:rPr>
+          <w:i/>
+          <w:iCs/>
+        </w:rPr>
+        <w:t xml:space="preserve">, 수집된 우선일/출원일에 </w:t>
+      </w:r>
+      <w:r>
+        <w:rPr>
+          <w:b/>
+          <w:bCs/>
+          <w:i/>
+          <w:iCs/>
+        </w:rPr>
+        <w:t xml:space="preserve">미국 특허 존속기간 규정(35 U.S.C. §154, 비가출원·PCT 출원일+20년)</w:t>
+      </w:r>
+      <w:r>
+        <w:rPr>
+          <w:i/>
+          <w:iCs/>
+        </w:rPr>
+        <w:t xml:space="preserve">을 적용해 </w:t>
+      </w:r>
+      <w:r>
+        <w:rPr>
+          <w:b/>
+          <w:bCs/>
+          <w:i/>
+          <w:iCs/>
+        </w:rPr>
+        <w:t xml:space="preserve">계산한 추정치</w:t>
+      </w:r>
+      <w:r>
+        <w:rPr>
+          <w:i/>
+          <w:iCs/>
+        </w:rPr>
+        <w:t xml:space="preserve">다. 다음을 </w:t>
+      </w:r>
+      <w:r>
+        <w:rPr>
+          <w:b/>
+          <w:bCs/>
+          <w:i/>
+          <w:iCs/>
+        </w:rPr>
+        <w:t xml:space="preserve">반영하지 않았다</w:t>
+      </w:r>
+      <w:r>
+        <w:rPr>
+          <w:i/>
+          <w:iCs/>
+        </w:rPr>
+        <w:t xml:space="preserve">: (i) </w:t>
+      </w:r>
+      <w:r>
+        <w:rPr>
+          <w:b/>
+          <w:bCs/>
+          <w:i/>
+          <w:iCs/>
+        </w:rPr>
+        <w:t xml:space="preserve">PTA</w:t>
+      </w:r>
+      <w:r>
+        <w:rPr>
+          <w:i/>
+          <w:iCs/>
+        </w:rPr>
+        <w:t xml:space="preserve">(특허존속기간조정, 심사지연으로 일수 가산 — 본 패밀리는 심사가 길어 수백 일 가산 가능), (ii) </w:t>
+      </w:r>
+      <w:r>
+        <w:rPr>
+          <w:b/>
+          <w:bCs/>
+          <w:i/>
+          <w:iCs/>
+        </w:rPr>
+        <w:t xml:space="preserve">PTE/Hatch-Waxman 연장</w:t>
+      </w:r>
+      <w:r>
+        <w:rPr>
+          <w:i/>
+          <w:iCs/>
+        </w:rPr>
+        <w:t xml:space="preserve">(icotrokinra가 2026-03 FDA 승인되었으므로 핵심 물질·조성물 특허, 특히 US11939361B2는 </w:t>
+      </w:r>
+      <w:r>
+        <w:rPr>
+          <w:b/>
+          <w:bCs/>
+          <w:i/>
+          <w:iCs/>
+        </w:rPr>
+        <w:t xml:space="preserve">최대 5년 연장</w:t>
+      </w:r>
+      <w:r>
+        <w:rPr>
+          <w:i/>
+          <w:iCs/>
+        </w:rPr>
+        <w:t xml:space="preserve"> 대상 가능), (iii) 가출원 vs 비가출원 구분 미검증(가출원 우선일을 쓴 경우 실제 기산일이 더 늦을 수 있음). 따라서 아래 값은 </w:t>
+      </w:r>
+      <w:r>
+        <w:rPr>
+          <w:b/>
+          <w:bCs/>
+          <w:i/>
+          <w:iCs/>
+        </w:rPr>
+        <w:t xml:space="preserve">명목 기본존속기간의 근사치</w:t>
+      </w:r>
+      <w:r>
+        <w:rPr>
+          <w:i/>
+          <w:iCs/>
+        </w:rPr>
+        <w:t xml:space="preserve">이며 법적 자문이 아니다.</w:t>
+      </w:r>
+    </w:p>
+    <w:p>
+      <w:pPr>
+        <w:spacing w:after="60"/>
+      </w:pPr>
+    </w:p>
+    <w:tbl>
+      <w:tblPr>
+        <w:tblW w:type="dxa" w:w="9360"/>
+        <w:tblBorders>
+          <w:top w:val="single" w:color="auto" w:sz="4"/>
+          <w:left w:val="single" w:color="auto" w:sz="4"/>
+          <w:bottom w:val="single" w:color="auto" w:sz="4"/>
+          <w:right w:val="single" w:color="auto" w:sz="4"/>
+          <w:insideH w:val="single" w:color="auto" w:sz="4"/>
+          <w:insideV w:val="single" w:color="auto" w:sz="4"/>
+        </w:tblBorders>
+      </w:tblPr>
+      <w:tblGrid>
+        <w:gridCol w:w="1872"/>
+        <w:gridCol w:w="1872"/>
+        <w:gridCol w:w="1872"/>
+        <w:gridCol w:w="1872"/>
+        <w:gridCol w:w="1872"/>
+      </w:tblGrid>
+      <w:tr>
+        <w:tc>
+          <w:tcPr>
+            <w:tcW w:type="dxa" w:w="1872"/>
+            <w:tcBorders>
+              <w:top w:val="single" w:color="BBBBBB" w:sz="1"/>
+              <w:left w:val="single" w:color="BBBBBB" w:sz="1"/>
+              <w:bottom w:val="single" w:color="BBBBBB" w:sz="1"/>
+              <w:right w:val="single" w:color="BBBBBB" w:sz="1"/>
+            </w:tcBorders>
+            <w:shd w:fill="D5E8F0" w:val="clear"/>
+            <w:tcMar>
+              <w:top w:type="dxa" w:w="60"/>
+              <w:left w:type="dxa" w:w="100"/>
+              <w:bottom w:type="dxa" w:w="60"/>
+              <w:right w:type="dxa" w:w="100"/>
+            </w:tcMar>
+          </w:tcPr>
+          <w:p>
+            <w:r>
+              <w:rPr>
+                <w:sz w:val="18"/>
+                <w:szCs w:val="18"/>
+              </w:rPr>
+              <w:t xml:space="preserve">patent_id</w:t>
+            </w:r>
+          </w:p>
+        </w:tc>
+        <w:tc>
+          <w:tcPr>
+            <w:tcW w:type="dxa" w:w="1872"/>
+            <w:tcBorders>
+              <w:top w:val="single" w:color="BBBBBB" w:sz="1"/>
+              <w:left w:val="single" w:color="BBBBBB" w:sz="1"/>
+              <w:bottom w:val="single" w:color="BBBBBB" w:sz="1"/>
+              <w:right w:val="single" w:color="BBBBBB" w:sz="1"/>
+            </w:tcBorders>
+            <w:shd w:fill="D5E8F0" w:val="clear"/>
+            <w:tcMar>
+              <w:top w:type="dxa" w:w="60"/>
+              <w:left w:type="dxa" w:w="100"/>
+              <w:bottom w:type="dxa" w:w="60"/>
+              <w:right w:type="dxa" w:w="100"/>
+            </w:tcMar>
+          </w:tcPr>
+          <w:p>
+            <w:r>
+              <w:rPr>
+                <w:sz w:val="18"/>
+                <w:szCs w:val="18"/>
+              </w:rPr>
+              <w:t xml:space="preserve">분류</w:t>
+            </w:r>
+          </w:p>
+        </w:tc>
+        <w:tc>
+          <w:tcPr>
+            <w:tcW w:type="dxa" w:w="1872"/>
+            <w:tcBorders>
+              <w:top w:val="single" w:color="BBBBBB" w:sz="1"/>
+              <w:left w:val="single" w:color="BBBBBB" w:sz="1"/>
+              <w:bottom w:val="single" w:color="BBBBBB" w:sz="1"/>
+              <w:right w:val="single" w:color="BBBBBB" w:sz="1"/>
+            </w:tcBorders>
+            <w:shd w:fill="D5E8F0" w:val="clear"/>
+            <w:tcMar>
+              <w:top w:type="dxa" w:w="60"/>
+              <w:left w:type="dxa" w:w="100"/>
+              <w:bottom w:type="dxa" w:w="60"/>
+              <w:right w:type="dxa" w:w="100"/>
+            </w:tcMar>
+          </w:tcPr>
+          <w:p>
+            <w:r>
+              <w:rPr>
+                <w:sz w:val="18"/>
+                <w:szCs w:val="18"/>
+              </w:rPr>
+              <w:t xml:space="preserve">기산일</w:t>
+            </w:r>
+          </w:p>
+        </w:tc>
+        <w:tc>
+          <w:tcPr>
+            <w:tcW w:type="dxa" w:w="1872"/>
+            <w:tcBorders>
+              <w:top w:val="single" w:color="BBBBBB" w:sz="1"/>
+              <w:left w:val="single" w:color="BBBBBB" w:sz="1"/>
+              <w:bottom w:val="single" w:color="BBBBBB" w:sz="1"/>
+              <w:right w:val="single" w:color="BBBBBB" w:sz="1"/>
+            </w:tcBorders>
+            <w:shd w:fill="D5E8F0" w:val="clear"/>
+            <w:tcMar>
+              <w:top w:type="dxa" w:w="60"/>
+              <w:left w:type="dxa" w:w="100"/>
+              <w:bottom w:type="dxa" w:w="60"/>
+              <w:right w:type="dxa" w:w="100"/>
+            </w:tcMar>
+          </w:tcPr>
+          <w:p>
+            <w:r>
+              <w:rPr>
+                <w:sz w:val="18"/>
+                <w:szCs w:val="18"/>
+              </w:rPr>
+              <w:t xml:space="preserve">기준</w:t>
+            </w:r>
+          </w:p>
+        </w:tc>
+        <w:tc>
+          <w:tcPr>
+            <w:tcW w:type="dxa" w:w="1872"/>
+            <w:tcBorders>
+              <w:top w:val="single" w:color="BBBBBB" w:sz="1"/>
+              <w:left w:val="single" w:color="BBBBBB" w:sz="1"/>
+              <w:bottom w:val="single" w:color="BBBBBB" w:sz="1"/>
+              <w:right w:val="single" w:color="BBBBBB" w:sz="1"/>
+            </w:tcBorders>
+            <w:shd w:fill="D5E8F0" w:val="clear"/>
+            <w:tcMar>
+              <w:top w:type="dxa" w:w="60"/>
+              <w:left w:type="dxa" w:w="100"/>
+              <w:bottom w:type="dxa" w:w="60"/>
+              <w:right w:type="dxa" w:w="100"/>
+            </w:tcMar>
+          </w:tcPr>
+          <w:p>
+            <w:r>
+              <w:rPr>
+                <w:sz w:val="18"/>
+                <w:szCs w:val="18"/>
+              </w:rPr>
+              <w:t xml:space="preserve">추정 만료(기본 20년)</w:t>
+            </w:r>
+          </w:p>
+        </w:tc>
+      </w:tr>
+      <w:tr>
+        <w:tc>
+          <w:tcPr>
+            <w:tcW w:type="dxa" w:w="1872"/>
+            <w:tcBorders>
+              <w:top w:val="single" w:color="BBBBBB" w:sz="1"/>
+              <w:left w:val="single" w:color="BBBBBB" w:sz="1"/>
+              <w:bottom w:val="single" w:color="BBBBBB" w:sz="1"/>
+              <w:right w:val="single" w:color="BBBBBB" w:sz="1"/>
+            </w:tcBorders>
+            <w:shd w:fill="FFFFFF" w:val="clear"/>
+            <w:tcMar>
+              <w:top w:type="dxa" w:w="60"/>
+              <w:left w:type="dxa" w:w="100"/>
+              <w:bottom w:type="dxa" w:w="60"/>
+              <w:right w:type="dxa" w:w="100"/>
+            </w:tcMar>
+          </w:tcPr>
+          <w:p>
+            <w:r>
+              <w:rPr>
+                <w:sz w:val="18"/>
+                <w:szCs w:val="18"/>
+              </w:rPr>
+              <w:t xml:space="preserve">CA3202226A1</w:t>
+            </w:r>
+          </w:p>
+        </w:tc>
+        <w:tc>
+          <w:tcPr>
+            <w:tcW w:type="dxa" w:w="1872"/>
+            <w:tcBorders>
+              <w:top w:val="single" w:color="BBBBBB" w:sz="1"/>
+              <w:left w:val="single" w:color="BBBBBB" w:sz="1"/>
+              <w:bottom w:val="single" w:color="BBBBBB" w:sz="1"/>
+              <w:right w:val="single" w:color="BBBBBB" w:sz="1"/>
+            </w:tcBorders>
+            <w:shd w:fill="FFFFFF" w:val="clear"/>
+            <w:tcMar>
+              <w:top w:type="dxa" w:w="60"/>
+              <w:left w:type="dxa" w:w="100"/>
+              <w:bottom w:type="dxa" w:w="60"/>
+              <w:right w:type="dxa" w:w="100"/>
+            </w:tcMar>
+          </w:tcPr>
+          <w:p>
+            <w:r>
+              <w:rPr>
+                <w:sz w:val="18"/>
+                <w:szCs w:val="18"/>
+              </w:rPr>
+              <w:t xml:space="preserve">진짜패밀리</w:t>
+            </w:r>
+          </w:p>
+        </w:tc>
+        <w:tc>
+          <w:tcPr>
+            <w:tcW w:type="dxa" w:w="1872"/>
+            <w:tcBorders>
+              <w:top w:val="single" w:color="BBBBBB" w:sz="1"/>
+              <w:left w:val="single" w:color="BBBBBB" w:sz="1"/>
+              <w:bottom w:val="single" w:color="BBBBBB" w:sz="1"/>
+              <w:right w:val="single" w:color="BBBBBB" w:sz="1"/>
+            </w:tcBorders>
+            <w:shd w:fill="FFFFFF" w:val="clear"/>
+            <w:tcMar>
+              <w:top w:type="dxa" w:w="60"/>
+              <w:left w:type="dxa" w:w="100"/>
+              <w:bottom w:type="dxa" w:w="60"/>
+              <w:right w:type="dxa" w:w="100"/>
+            </w:tcMar>
+          </w:tcPr>
+          <w:p>
+            <w:r>
+              <w:rPr>
+                <w:sz w:val="18"/>
+                <w:szCs w:val="18"/>
+              </w:rPr>
+              <w:t xml:space="preserve">2021-11-19</w:t>
+            </w:r>
+          </w:p>
+        </w:tc>
+        <w:tc>
+          <w:tcPr>
+            <w:tcW w:type="dxa" w:w="1872"/>
+            <w:tcBorders>
+              <w:top w:val="single" w:color="BBBBBB" w:sz="1"/>
+              <w:left w:val="single" w:color="BBBBBB" w:sz="1"/>
+              <w:bottom w:val="single" w:color="BBBBBB" w:sz="1"/>
+              <w:right w:val="single" w:color="BBBBBB" w:sz="1"/>
+            </w:tcBorders>
+            <w:shd w:fill="FFFFFF" w:val="clear"/>
+            <w:tcMar>
+              <w:top w:type="dxa" w:w="60"/>
+              <w:left w:type="dxa" w:w="100"/>
+              <w:bottom w:type="dxa" w:w="60"/>
+              <w:right w:type="dxa" w:w="100"/>
+            </w:tcMar>
+          </w:tcPr>
+          <w:p>
+            <w:r>
+              <w:rPr>
+                <w:sz w:val="18"/>
+                <w:szCs w:val="18"/>
+              </w:rPr>
+              <w:t xml:space="preserve">출원일</w:t>
+            </w:r>
+          </w:p>
+        </w:tc>
+        <w:tc>
+          <w:tcPr>
+            <w:tcW w:type="dxa" w:w="1872"/>
+            <w:tcBorders>
+              <w:top w:val="single" w:color="BBBBBB" w:sz="1"/>
+              <w:left w:val="single" w:color="BBBBBB" w:sz="1"/>
+              <w:bottom w:val="single" w:color="BBBBBB" w:sz="1"/>
+              <w:right w:val="single" w:color="BBBBBB" w:sz="1"/>
+            </w:tcBorders>
+            <w:shd w:fill="FFFFFF" w:val="clear"/>
+            <w:tcMar>
+              <w:top w:type="dxa" w:w="60"/>
+              <w:left w:type="dxa" w:w="100"/>
+              <w:bottom w:type="dxa" w:w="60"/>
+              <w:right w:type="dxa" w:w="100"/>
+            </w:tcMar>
+          </w:tcPr>
+          <w:p>
+            <w:r>
+              <w:rPr>
+                <w:sz w:val="18"/>
+                <w:szCs w:val="18"/>
+              </w:rPr>
+              <w:t xml:space="preserve">2041-11-19  (출원일+20년; PTA/PTE 미반영)</w:t>
+            </w:r>
+          </w:p>
+        </w:tc>
+      </w:tr>
+      <w:tr>
+        <w:tc>
+          <w:tcPr>
+            <w:tcW w:type="dxa" w:w="1872"/>
+            <w:tcBorders>
+              <w:top w:val="single" w:color="BBBBBB" w:sz="1"/>
+              <w:left w:val="single" w:color="BBBBBB" w:sz="1"/>
+              <w:bottom w:val="single" w:color="BBBBBB" w:sz="1"/>
+              <w:right w:val="single" w:color="BBBBBB" w:sz="1"/>
+            </w:tcBorders>
+            <w:shd w:fill="FFFFFF" w:val="clear"/>
+            <w:tcMar>
+              <w:top w:type="dxa" w:w="60"/>
+              <w:left w:type="dxa" w:w="100"/>
+              <w:bottom w:type="dxa" w:w="60"/>
+              <w:right w:type="dxa" w:w="100"/>
+            </w:tcMar>
+          </w:tcPr>
+          <w:p>
+            <w:r>
+              <w:rPr>
+                <w:sz w:val="18"/>
+                <w:szCs w:val="18"/>
+              </w:rPr>
+              <w:t xml:space="preserve">JP2023145581A</w:t>
+            </w:r>
+          </w:p>
+        </w:tc>
+        <w:tc>
+          <w:tcPr>
+            <w:tcW w:type="dxa" w:w="1872"/>
+            <w:tcBorders>
+              <w:top w:val="single" w:color="BBBBBB" w:sz="1"/>
+              <w:left w:val="single" w:color="BBBBBB" w:sz="1"/>
+              <w:bottom w:val="single" w:color="BBBBBB" w:sz="1"/>
+              <w:right w:val="single" w:color="BBBBBB" w:sz="1"/>
+            </w:tcBorders>
+            <w:shd w:fill="FFFFFF" w:val="clear"/>
+            <w:tcMar>
+              <w:top w:type="dxa" w:w="60"/>
+              <w:left w:type="dxa" w:w="100"/>
+              <w:bottom w:type="dxa" w:w="60"/>
+              <w:right w:type="dxa" w:w="100"/>
+            </w:tcMar>
+          </w:tcPr>
+          <w:p>
+            <w:r>
+              <w:rPr>
+                <w:sz w:val="18"/>
+                <w:szCs w:val="18"/>
+              </w:rPr>
+              <w:t xml:space="preserve">진짜패밀리</w:t>
+            </w:r>
+          </w:p>
+        </w:tc>
+        <w:tc>
+          <w:tcPr>
+            <w:tcW w:type="dxa" w:w="1872"/>
+            <w:tcBorders>
+              <w:top w:val="single" w:color="BBBBBB" w:sz="1"/>
+              <w:left w:val="single" w:color="BBBBBB" w:sz="1"/>
+              <w:bottom w:val="single" w:color="BBBBBB" w:sz="1"/>
+              <w:right w:val="single" w:color="BBBBBB" w:sz="1"/>
+            </w:tcBorders>
+            <w:shd w:fill="FFFFFF" w:val="clear"/>
+            <w:tcMar>
+              <w:top w:type="dxa" w:w="60"/>
+              <w:left w:type="dxa" w:w="100"/>
+              <w:bottom w:type="dxa" w:w="60"/>
+              <w:right w:type="dxa" w:w="100"/>
+            </w:tcMar>
+          </w:tcPr>
+          <w:p>
+            <w:r>
+              <w:rPr>
+                <w:sz w:val="18"/>
+                <w:szCs w:val="18"/>
+              </w:rPr>
+              <w:t xml:space="preserve">2023-07-24</w:t>
+            </w:r>
+          </w:p>
+        </w:tc>
+        <w:tc>
+          <w:tcPr>
+            <w:tcW w:type="dxa" w:w="1872"/>
+            <w:tcBorders>
+              <w:top w:val="single" w:color="BBBBBB" w:sz="1"/>
+              <w:left w:val="single" w:color="BBBBBB" w:sz="1"/>
+              <w:bottom w:val="single" w:color="BBBBBB" w:sz="1"/>
+              <w:right w:val="single" w:color="BBBBBB" w:sz="1"/>
+            </w:tcBorders>
+            <w:shd w:fill="FFFFFF" w:val="clear"/>
+            <w:tcMar>
+              <w:top w:type="dxa" w:w="60"/>
+              <w:left w:type="dxa" w:w="100"/>
+              <w:bottom w:type="dxa" w:w="60"/>
+              <w:right w:type="dxa" w:w="100"/>
+            </w:tcMar>
+          </w:tcPr>
+          <w:p>
+            <w:r>
+              <w:rPr>
+                <w:sz w:val="18"/>
+                <w:szCs w:val="18"/>
+              </w:rPr>
+              <w:t xml:space="preserve">출원일</w:t>
+            </w:r>
+          </w:p>
+        </w:tc>
+        <w:tc>
+          <w:tcPr>
+            <w:tcW w:type="dxa" w:w="1872"/>
+            <w:tcBorders>
+              <w:top w:val="single" w:color="BBBBBB" w:sz="1"/>
+              <w:left w:val="single" w:color="BBBBBB" w:sz="1"/>
+              <w:bottom w:val="single" w:color="BBBBBB" w:sz="1"/>
+              <w:right w:val="single" w:color="BBBBBB" w:sz="1"/>
+            </w:tcBorders>
+            <w:shd w:fill="FFFFFF" w:val="clear"/>
+            <w:tcMar>
+              <w:top w:type="dxa" w:w="60"/>
+              <w:left w:type="dxa" w:w="100"/>
+              <w:bottom w:type="dxa" w:w="60"/>
+              <w:right w:type="dxa" w:w="100"/>
+            </w:tcMar>
+          </w:tcPr>
+          <w:p>
+            <w:r>
+              <w:rPr>
+                <w:sz w:val="18"/>
+                <w:szCs w:val="18"/>
+              </w:rPr>
+              <w:t xml:space="preserve">2043-07-24  (출원일+20년; PTA/PTE 미반영)</w:t>
+            </w:r>
+          </w:p>
+        </w:tc>
+      </w:tr>
+      <w:tr>
+        <w:tc>
+          <w:tcPr>
+            <w:tcW w:type="dxa" w:w="1872"/>
+            <w:tcBorders>
+              <w:top w:val="single" w:color="BBBBBB" w:sz="1"/>
+              <w:left w:val="single" w:color="BBBBBB" w:sz="1"/>
+              <w:bottom w:val="single" w:color="BBBBBB" w:sz="1"/>
+              <w:right w:val="single" w:color="BBBBBB" w:sz="1"/>
+            </w:tcBorders>
+            <w:shd w:fill="FFFFFF" w:val="clear"/>
+            <w:tcMar>
+              <w:top w:type="dxa" w:w="60"/>
+              <w:left w:type="dxa" w:w="100"/>
+              <w:bottom w:type="dxa" w:w="60"/>
+              <w:right w:type="dxa" w:w="100"/>
+            </w:tcMar>
+          </w:tcPr>
+          <w:p>
+            <w:r>
+              <w:rPr>
+                <w:sz w:val="18"/>
+                <w:szCs w:val="18"/>
+              </w:rPr>
+              <w:t xml:space="preserve">US10023614B2</w:t>
+            </w:r>
+          </w:p>
+        </w:tc>
+        <w:tc>
+          <w:tcPr>
+            <w:tcW w:type="dxa" w:w="1872"/>
+            <w:tcBorders>
+              <w:top w:val="single" w:color="BBBBBB" w:sz="1"/>
+              <w:left w:val="single" w:color="BBBBBB" w:sz="1"/>
+              <w:bottom w:val="single" w:color="BBBBBB" w:sz="1"/>
+              <w:right w:val="single" w:color="BBBBBB" w:sz="1"/>
+            </w:tcBorders>
+            <w:shd w:fill="FFFFFF" w:val="clear"/>
+            <w:tcMar>
+              <w:top w:type="dxa" w:w="60"/>
+              <w:left w:type="dxa" w:w="100"/>
+              <w:bottom w:type="dxa" w:w="60"/>
+              <w:right w:type="dxa" w:w="100"/>
+            </w:tcMar>
+          </w:tcPr>
+          <w:p>
+            <w:r>
+              <w:rPr>
+                <w:sz w:val="18"/>
+                <w:szCs w:val="18"/>
+              </w:rPr>
+              <w:t xml:space="preserve">진짜패밀리</w:t>
+            </w:r>
+          </w:p>
+        </w:tc>
+        <w:tc>
+          <w:tcPr>
+            <w:tcW w:type="dxa" w:w="1872"/>
+            <w:tcBorders>
+              <w:top w:val="single" w:color="BBBBBB" w:sz="1"/>
+              <w:left w:val="single" w:color="BBBBBB" w:sz="1"/>
+              <w:bottom w:val="single" w:color="BBBBBB" w:sz="1"/>
+              <w:right w:val="single" w:color="BBBBBB" w:sz="1"/>
+            </w:tcBorders>
+            <w:shd w:fill="FFFFFF" w:val="clear"/>
+            <w:tcMar>
+              <w:top w:type="dxa" w:w="60"/>
+              <w:left w:type="dxa" w:w="100"/>
+              <w:bottom w:type="dxa" w:w="60"/>
+              <w:right w:type="dxa" w:w="100"/>
+            </w:tcMar>
+          </w:tcPr>
+          <w:p>
+            <w:r>
+              <w:rPr>
+                <w:sz w:val="18"/>
+                <w:szCs w:val="18"/>
+              </w:rPr>
+              <w:t xml:space="preserve">2014-07-17</w:t>
+            </w:r>
+          </w:p>
+        </w:tc>
+        <w:tc>
+          <w:tcPr>
+            <w:tcW w:type="dxa" w:w="1872"/>
+            <w:tcBorders>
+              <w:top w:val="single" w:color="BBBBBB" w:sz="1"/>
+              <w:left w:val="single" w:color="BBBBBB" w:sz="1"/>
+              <w:bottom w:val="single" w:color="BBBBBB" w:sz="1"/>
+              <w:right w:val="single" w:color="BBBBBB" w:sz="1"/>
+            </w:tcBorders>
+            <w:shd w:fill="FFFFFF" w:val="clear"/>
+            <w:tcMar>
+              <w:top w:type="dxa" w:w="60"/>
+              <w:left w:type="dxa" w:w="100"/>
+              <w:bottom w:type="dxa" w:w="60"/>
+              <w:right w:type="dxa" w:w="100"/>
+            </w:tcMar>
+          </w:tcPr>
+          <w:p>
+            <w:r>
+              <w:rPr>
+                <w:sz w:val="18"/>
+                <w:szCs w:val="18"/>
+              </w:rPr>
+              <w:t xml:space="preserve">우선일</w:t>
+            </w:r>
+          </w:p>
+        </w:tc>
+        <w:tc>
+          <w:tcPr>
+            <w:tcW w:type="dxa" w:w="1872"/>
+            <w:tcBorders>
+              <w:top w:val="single" w:color="BBBBBB" w:sz="1"/>
+              <w:left w:val="single" w:color="BBBBBB" w:sz="1"/>
+              <w:bottom w:val="single" w:color="BBBBBB" w:sz="1"/>
+              <w:right w:val="single" w:color="BBBBBB" w:sz="1"/>
+            </w:tcBorders>
+            <w:shd w:fill="FFFFFF" w:val="clear"/>
+            <w:tcMar>
+              <w:top w:type="dxa" w:w="60"/>
+              <w:left w:type="dxa" w:w="100"/>
+              <w:bottom w:type="dxa" w:w="60"/>
+              <w:right w:type="dxa" w:w="100"/>
+            </w:tcMar>
+          </w:tcPr>
+          <w:p>
+            <w:r>
+              <w:rPr>
+                <w:sz w:val="18"/>
+                <w:szCs w:val="18"/>
+              </w:rPr>
+              <w:t xml:space="preserve">2034-07-17  (우선일+20년; PTA/PTE 미반영)</w:t>
+            </w:r>
+          </w:p>
+        </w:tc>
+      </w:tr>
+      <w:tr>
+        <w:tc>
+          <w:tcPr>
+            <w:tcW w:type="dxa" w:w="1872"/>
+            <w:tcBorders>
+              <w:top w:val="single" w:color="BBBBBB" w:sz="1"/>
+              <w:left w:val="single" w:color="BBBBBB" w:sz="1"/>
+              <w:bottom w:val="single" w:color="BBBBBB" w:sz="1"/>
+              <w:right w:val="single" w:color="BBBBBB" w:sz="1"/>
+            </w:tcBorders>
+            <w:shd w:fill="FFFFFF" w:val="clear"/>
+            <w:tcMar>
+              <w:top w:type="dxa" w:w="60"/>
+              <w:left w:type="dxa" w:w="100"/>
+              <w:bottom w:type="dxa" w:w="60"/>
+              <w:right w:type="dxa" w:w="100"/>
+            </w:tcMar>
+          </w:tcPr>
+          <w:p>
+            <w:r>
+              <w:rPr>
+                <w:sz w:val="18"/>
+                <w:szCs w:val="18"/>
+              </w:rPr>
+              <w:t xml:space="preserve">US10787490B2</w:t>
+            </w:r>
+          </w:p>
+        </w:tc>
+        <w:tc>
+          <w:tcPr>
+            <w:tcW w:type="dxa" w:w="1872"/>
+            <w:tcBorders>
+              <w:top w:val="single" w:color="BBBBBB" w:sz="1"/>
+              <w:left w:val="single" w:color="BBBBBB" w:sz="1"/>
+              <w:bottom w:val="single" w:color="BBBBBB" w:sz="1"/>
+              <w:right w:val="single" w:color="BBBBBB" w:sz="1"/>
+            </w:tcBorders>
+            <w:shd w:fill="FFFFFF" w:val="clear"/>
+            <w:tcMar>
+              <w:top w:type="dxa" w:w="60"/>
+              <w:left w:type="dxa" w:w="100"/>
+              <w:bottom w:type="dxa" w:w="60"/>
+              <w:right w:type="dxa" w:w="100"/>
+            </w:tcMar>
+          </w:tcPr>
+          <w:p>
+            <w:r>
+              <w:rPr>
+                <w:sz w:val="18"/>
+                <w:szCs w:val="18"/>
+              </w:rPr>
+              <w:t xml:space="preserve">진짜패밀리</w:t>
+            </w:r>
+          </w:p>
+        </w:tc>
+        <w:tc>
+          <w:tcPr>
+            <w:tcW w:type="dxa" w:w="1872"/>
+            <w:tcBorders>
+              <w:top w:val="single" w:color="BBBBBB" w:sz="1"/>
+              <w:left w:val="single" w:color="BBBBBB" w:sz="1"/>
+              <w:bottom w:val="single" w:color="BBBBBB" w:sz="1"/>
+              <w:right w:val="single" w:color="BBBBBB" w:sz="1"/>
+            </w:tcBorders>
+            <w:shd w:fill="FFFFFF" w:val="clear"/>
+            <w:tcMar>
+              <w:top w:type="dxa" w:w="60"/>
+              <w:left w:type="dxa" w:w="100"/>
+              <w:bottom w:type="dxa" w:w="60"/>
+              <w:right w:type="dxa" w:w="100"/>
+            </w:tcMar>
+          </w:tcPr>
+          <w:p>
+            <w:r>
+              <w:rPr>
+                <w:sz w:val="18"/>
+                <w:szCs w:val="18"/>
+              </w:rPr>
+              <w:t xml:space="preserve">2015-07-15</w:t>
+            </w:r>
+          </w:p>
+        </w:tc>
+        <w:tc>
+          <w:tcPr>
+            <w:tcW w:type="dxa" w:w="1872"/>
+            <w:tcBorders>
+              <w:top w:val="single" w:color="BBBBBB" w:sz="1"/>
+              <w:left w:val="single" w:color="BBBBBB" w:sz="1"/>
+              <w:bottom w:val="single" w:color="BBBBBB" w:sz="1"/>
+              <w:right w:val="single" w:color="BBBBBB" w:sz="1"/>
+            </w:tcBorders>
+            <w:shd w:fill="FFFFFF" w:val="clear"/>
+            <w:tcMar>
+              <w:top w:type="dxa" w:w="60"/>
+              <w:left w:type="dxa" w:w="100"/>
+              <w:bottom w:type="dxa" w:w="60"/>
+              <w:right w:type="dxa" w:w="100"/>
+            </w:tcMar>
+          </w:tcPr>
+          <w:p>
+            <w:r>
+              <w:rPr>
+                <w:sz w:val="18"/>
+                <w:szCs w:val="18"/>
+              </w:rPr>
+              <w:t xml:space="preserve">우선일</w:t>
+            </w:r>
+          </w:p>
+        </w:tc>
+        <w:tc>
+          <w:tcPr>
+            <w:tcW w:type="dxa" w:w="1872"/>
+            <w:tcBorders>
+              <w:top w:val="single" w:color="BBBBBB" w:sz="1"/>
+              <w:left w:val="single" w:color="BBBBBB" w:sz="1"/>
+              <w:bottom w:val="single" w:color="BBBBBB" w:sz="1"/>
+              <w:right w:val="single" w:color="BBBBBB" w:sz="1"/>
+            </w:tcBorders>
+            <w:shd w:fill="FFFFFF" w:val="clear"/>
+            <w:tcMar>
+              <w:top w:type="dxa" w:w="60"/>
+              <w:left w:type="dxa" w:w="100"/>
+              <w:bottom w:type="dxa" w:w="60"/>
+              <w:right w:type="dxa" w:w="100"/>
+            </w:tcMar>
+          </w:tcPr>
+          <w:p>
+            <w:r>
+              <w:rPr>
+                <w:sz w:val="18"/>
+                <w:szCs w:val="18"/>
+              </w:rPr>
+              <w:t xml:space="preserve">2035-07-15  (우선일+20년; PTA/PTE 미반영)</w:t>
+            </w:r>
+          </w:p>
+        </w:tc>
+      </w:tr>
+      <w:tr>
+        <w:tc>
+          <w:tcPr>
+            <w:tcW w:type="dxa" w:w="1872"/>
+            <w:tcBorders>
+              <w:top w:val="single" w:color="BBBBBB" w:sz="1"/>
+              <w:left w:val="single" w:color="BBBBBB" w:sz="1"/>
+              <w:bottom w:val="single" w:color="BBBBBB" w:sz="1"/>
+              <w:right w:val="single" w:color="BBBBBB" w:sz="1"/>
+            </w:tcBorders>
+            <w:shd w:fill="FFFFFF" w:val="clear"/>
+            <w:tcMar>
+              <w:top w:type="dxa" w:w="60"/>
+              <w:left w:type="dxa" w:w="100"/>
+              <w:bottom w:type="dxa" w:w="60"/>
+              <w:right w:type="dxa" w:w="100"/>
+            </w:tcMar>
+          </w:tcPr>
+          <w:p>
+            <w:r>
+              <w:rPr>
+                <w:sz w:val="18"/>
+                <w:szCs w:val="18"/>
+              </w:rPr>
+              <w:t xml:space="preserve">US10941183B2</w:t>
+            </w:r>
+          </w:p>
+        </w:tc>
+        <w:tc>
+          <w:tcPr>
+            <w:tcW w:type="dxa" w:w="1872"/>
+            <w:tcBorders>
+              <w:top w:val="single" w:color="BBBBBB" w:sz="1"/>
+              <w:left w:val="single" w:color="BBBBBB" w:sz="1"/>
+              <w:bottom w:val="single" w:color="BBBBBB" w:sz="1"/>
+              <w:right w:val="single" w:color="BBBBBB" w:sz="1"/>
+            </w:tcBorders>
+            <w:shd w:fill="FFFFFF" w:val="clear"/>
+            <w:tcMar>
+              <w:top w:type="dxa" w:w="60"/>
+              <w:left w:type="dxa" w:w="100"/>
+              <w:bottom w:type="dxa" w:w="60"/>
+              <w:right w:type="dxa" w:w="100"/>
+            </w:tcMar>
+          </w:tcPr>
+          <w:p>
+            <w:r>
+              <w:rPr>
+                <w:sz w:val="18"/>
+                <w:szCs w:val="18"/>
+              </w:rPr>
+              <w:t xml:space="preserve">진짜패밀리</w:t>
+            </w:r>
+          </w:p>
+        </w:tc>
+        <w:tc>
+          <w:tcPr>
+            <w:tcW w:type="dxa" w:w="1872"/>
+            <w:tcBorders>
+              <w:top w:val="single" w:color="BBBBBB" w:sz="1"/>
+              <w:left w:val="single" w:color="BBBBBB" w:sz="1"/>
+              <w:bottom w:val="single" w:color="BBBBBB" w:sz="1"/>
+              <w:right w:val="single" w:color="BBBBBB" w:sz="1"/>
+            </w:tcBorders>
+            <w:shd w:fill="FFFFFF" w:val="clear"/>
+            <w:tcMar>
+              <w:top w:type="dxa" w:w="60"/>
+              <w:left w:type="dxa" w:w="100"/>
+              <w:bottom w:type="dxa" w:w="60"/>
+              <w:right w:type="dxa" w:w="100"/>
+            </w:tcMar>
+          </w:tcPr>
+          <w:p>
+            <w:r>
+              <w:rPr>
+                <w:sz w:val="18"/>
+                <w:szCs w:val="18"/>
+              </w:rPr>
+              <w:t xml:space="preserve">2014-07-17</w:t>
+            </w:r>
+          </w:p>
+        </w:tc>
+        <w:tc>
+          <w:tcPr>
+            <w:tcW w:type="dxa" w:w="1872"/>
+            <w:tcBorders>
+              <w:top w:val="single" w:color="BBBBBB" w:sz="1"/>
+              <w:left w:val="single" w:color="BBBBBB" w:sz="1"/>
+              <w:bottom w:val="single" w:color="BBBBBB" w:sz="1"/>
+              <w:right w:val="single" w:color="BBBBBB" w:sz="1"/>
+            </w:tcBorders>
+            <w:shd w:fill="FFFFFF" w:val="clear"/>
+            <w:tcMar>
+              <w:top w:type="dxa" w:w="60"/>
+              <w:left w:type="dxa" w:w="100"/>
+              <w:bottom w:type="dxa" w:w="60"/>
+              <w:right w:type="dxa" w:w="100"/>
+            </w:tcMar>
+          </w:tcPr>
+          <w:p>
+            <w:r>
+              <w:rPr>
+                <w:sz w:val="18"/>
+                <w:szCs w:val="18"/>
+              </w:rPr>
+              <w:t xml:space="preserve">우선일</w:t>
+            </w:r>
+          </w:p>
+        </w:tc>
+        <w:tc>
+          <w:tcPr>
+            <w:tcW w:type="dxa" w:w="1872"/>
+            <w:tcBorders>
+              <w:top w:val="single" w:color="BBBBBB" w:sz="1"/>
+              <w:left w:val="single" w:color="BBBBBB" w:sz="1"/>
+              <w:bottom w:val="single" w:color="BBBBBB" w:sz="1"/>
+              <w:right w:val="single" w:color="BBBBBB" w:sz="1"/>
+            </w:tcBorders>
+            <w:shd w:fill="FFFFFF" w:val="clear"/>
+            <w:tcMar>
+              <w:top w:type="dxa" w:w="60"/>
+              <w:left w:type="dxa" w:w="100"/>
+              <w:bottom w:type="dxa" w:w="60"/>
+              <w:right w:type="dxa" w:w="100"/>
+            </w:tcMar>
+          </w:tcPr>
+          <w:p>
+            <w:r>
+              <w:rPr>
+                <w:sz w:val="18"/>
+                <w:szCs w:val="18"/>
+              </w:rPr>
+              <w:t xml:space="preserve">2034-07-17  (우선일+20년; PTA/PTE 미반영)</w:t>
+            </w:r>
+          </w:p>
+        </w:tc>
+      </w:tr>
+      <w:tr>
+        <w:tc>
+          <w:tcPr>
+            <w:tcW w:type="dxa" w:w="1872"/>
+            <w:tcBorders>
+              <w:top w:val="single" w:color="BBBBBB" w:sz="1"/>
+              <w:left w:val="single" w:color="BBBBBB" w:sz="1"/>
+              <w:bottom w:val="single" w:color="BBBBBB" w:sz="1"/>
+              <w:right w:val="single" w:color="BBBBBB" w:sz="1"/>
+            </w:tcBorders>
+            <w:shd w:fill="FFFFFF" w:val="clear"/>
+            <w:tcMar>
+              <w:top w:type="dxa" w:w="60"/>
+              <w:left w:type="dxa" w:w="100"/>
+              <w:bottom w:type="dxa" w:w="60"/>
+              <w:right w:type="dxa" w:w="100"/>
+            </w:tcMar>
+          </w:tcPr>
+          <w:p>
+            <w:r>
+              <w:rPr>
+                <w:sz w:val="18"/>
+                <w:szCs w:val="18"/>
+              </w:rPr>
+              <w:t xml:space="preserve">US11041000B2</w:t>
+            </w:r>
+          </w:p>
+        </w:tc>
+        <w:tc>
+          <w:tcPr>
+            <w:tcW w:type="dxa" w:w="1872"/>
+            <w:tcBorders>
+              <w:top w:val="single" w:color="BBBBBB" w:sz="1"/>
+              <w:left w:val="single" w:color="BBBBBB" w:sz="1"/>
+              <w:bottom w:val="single" w:color="BBBBBB" w:sz="1"/>
+              <w:right w:val="single" w:color="BBBBBB" w:sz="1"/>
+            </w:tcBorders>
+            <w:shd w:fill="FFFFFF" w:val="clear"/>
+            <w:tcMar>
+              <w:top w:type="dxa" w:w="60"/>
+              <w:left w:type="dxa" w:w="100"/>
+              <w:bottom w:type="dxa" w:w="60"/>
+              <w:right w:type="dxa" w:w="100"/>
+            </w:tcMar>
+          </w:tcPr>
+          <w:p>
+            <w:r>
+              <w:rPr>
+                <w:sz w:val="18"/>
+                <w:szCs w:val="18"/>
+              </w:rPr>
+              <w:t xml:space="preserve">진짜패밀리</w:t>
+            </w:r>
+          </w:p>
+        </w:tc>
+        <w:tc>
+          <w:tcPr>
+            <w:tcW w:type="dxa" w:w="1872"/>
+            <w:tcBorders>
+              <w:top w:val="single" w:color="BBBBBB" w:sz="1"/>
+              <w:left w:val="single" w:color="BBBBBB" w:sz="1"/>
+              <w:bottom w:val="single" w:color="BBBBBB" w:sz="1"/>
+              <w:right w:val="single" w:color="BBBBBB" w:sz="1"/>
+            </w:tcBorders>
+            <w:shd w:fill="FFFFFF" w:val="clear"/>
+            <w:tcMar>
+              <w:top w:type="dxa" w:w="60"/>
+              <w:left w:type="dxa" w:w="100"/>
+              <w:bottom w:type="dxa" w:w="60"/>
+              <w:right w:type="dxa" w:w="100"/>
+            </w:tcMar>
+          </w:tcPr>
+          <w:p>
+            <w:r>
+              <w:rPr>
+                <w:sz w:val="18"/>
+                <w:szCs w:val="18"/>
+              </w:rPr>
+              <w:t xml:space="preserve">2019-07-10</w:t>
+            </w:r>
+          </w:p>
+        </w:tc>
+        <w:tc>
+          <w:tcPr>
+            <w:tcW w:type="dxa" w:w="1872"/>
+            <w:tcBorders>
+              <w:top w:val="single" w:color="BBBBBB" w:sz="1"/>
+              <w:left w:val="single" w:color="BBBBBB" w:sz="1"/>
+              <w:bottom w:val="single" w:color="BBBBBB" w:sz="1"/>
+              <w:right w:val="single" w:color="BBBBBB" w:sz="1"/>
+            </w:tcBorders>
+            <w:shd w:fill="FFFFFF" w:val="clear"/>
+            <w:tcMar>
+              <w:top w:type="dxa" w:w="60"/>
+              <w:left w:type="dxa" w:w="100"/>
+              <w:bottom w:type="dxa" w:w="60"/>
+              <w:right w:type="dxa" w:w="100"/>
+            </w:tcMar>
+          </w:tcPr>
+          <w:p>
+            <w:r>
+              <w:rPr>
+                <w:sz w:val="18"/>
+                <w:szCs w:val="18"/>
+              </w:rPr>
+              <w:t xml:space="preserve">우선일</w:t>
+            </w:r>
+          </w:p>
+        </w:tc>
+        <w:tc>
+          <w:tcPr>
+            <w:tcW w:type="dxa" w:w="1872"/>
+            <w:tcBorders>
+              <w:top w:val="single" w:color="BBBBBB" w:sz="1"/>
+              <w:left w:val="single" w:color="BBBBBB" w:sz="1"/>
+              <w:bottom w:val="single" w:color="BBBBBB" w:sz="1"/>
+              <w:right w:val="single" w:color="BBBBBB" w:sz="1"/>
+            </w:tcBorders>
+            <w:shd w:fill="FFFFFF" w:val="clear"/>
+            <w:tcMar>
+              <w:top w:type="dxa" w:w="60"/>
+              <w:left w:type="dxa" w:w="100"/>
+              <w:bottom w:type="dxa" w:w="60"/>
+              <w:right w:type="dxa" w:w="100"/>
+            </w:tcMar>
+          </w:tcPr>
+          <w:p>
+            <w:r>
+              <w:rPr>
+                <w:sz w:val="18"/>
+                <w:szCs w:val="18"/>
+              </w:rPr>
+              <w:t xml:space="preserve">2039-07-10  (우선일+20년; PTA/PTE 미반영)</w:t>
+            </w:r>
+          </w:p>
+        </w:tc>
+      </w:tr>
+      <w:tr>
+        <w:tc>
+          <w:tcPr>
+            <w:tcW w:type="dxa" w:w="1872"/>
+            <w:tcBorders>
+              <w:top w:val="single" w:color="BBBBBB" w:sz="1"/>
+              <w:left w:val="single" w:color="BBBBBB" w:sz="1"/>
+              <w:bottom w:val="single" w:color="BBBBBB" w:sz="1"/>
+              <w:right w:val="single" w:color="BBBBBB" w:sz="1"/>
+            </w:tcBorders>
+            <w:shd w:fill="FFFFFF" w:val="clear"/>
+            <w:tcMar>
+              <w:top w:type="dxa" w:w="60"/>
+              <w:left w:type="dxa" w:w="100"/>
+              <w:bottom w:type="dxa" w:w="60"/>
+              <w:right w:type="dxa" w:w="100"/>
+            </w:tcMar>
+          </w:tcPr>
+          <w:p>
+            <w:r>
+              <w:rPr>
+                <w:sz w:val="18"/>
+                <w:szCs w:val="18"/>
+              </w:rPr>
+              <w:t xml:space="preserve">US11180535B2</w:t>
+            </w:r>
+          </w:p>
+        </w:tc>
+        <w:tc>
+          <w:tcPr>
+            <w:tcW w:type="dxa" w:w="1872"/>
+            <w:tcBorders>
+              <w:top w:val="single" w:color="BBBBBB" w:sz="1"/>
+              <w:left w:val="single" w:color="BBBBBB" w:sz="1"/>
+              <w:bottom w:val="single" w:color="BBBBBB" w:sz="1"/>
+              <w:right w:val="single" w:color="BBBBBB" w:sz="1"/>
+            </w:tcBorders>
+            <w:shd w:fill="FFFFFF" w:val="clear"/>
+            <w:tcMar>
+              <w:top w:type="dxa" w:w="60"/>
+              <w:left w:type="dxa" w:w="100"/>
+              <w:bottom w:type="dxa" w:w="60"/>
+              <w:right w:type="dxa" w:w="100"/>
+            </w:tcMar>
+          </w:tcPr>
+          <w:p>
+            <w:r>
+              <w:rPr>
+                <w:sz w:val="18"/>
+                <w:szCs w:val="18"/>
+              </w:rPr>
+              <w:t xml:space="preserve">오귀속/무관</w:t>
+            </w:r>
+          </w:p>
+        </w:tc>
+        <w:tc>
+          <w:tcPr>
+            <w:tcW w:type="dxa" w:w="1872"/>
+            <w:tcBorders>
+              <w:top w:val="single" w:color="BBBBBB" w:sz="1"/>
+              <w:left w:val="single" w:color="BBBBBB" w:sz="1"/>
+              <w:bottom w:val="single" w:color="BBBBBB" w:sz="1"/>
+              <w:right w:val="single" w:color="BBBBBB" w:sz="1"/>
+            </w:tcBorders>
+            <w:shd w:fill="FFFFFF" w:val="clear"/>
+            <w:tcMar>
+              <w:top w:type="dxa" w:w="60"/>
+              <w:left w:type="dxa" w:w="100"/>
+              <w:bottom w:type="dxa" w:w="60"/>
+              <w:right w:type="dxa" w:w="100"/>
+            </w:tcMar>
+          </w:tcPr>
+          <w:p>
+            <w:r>
+              <w:rPr>
+                <w:sz w:val="18"/>
+                <w:szCs w:val="18"/>
+              </w:rPr>
+              <w:t xml:space="preserve">-</w:t>
+            </w:r>
+          </w:p>
+        </w:tc>
+        <w:tc>
+          <w:tcPr>
+            <w:tcW w:type="dxa" w:w="1872"/>
+            <w:tcBorders>
+              <w:top w:val="single" w:color="BBBBBB" w:sz="1"/>
+              <w:left w:val="single" w:color="BBBBBB" w:sz="1"/>
+              <w:bottom w:val="single" w:color="BBBBBB" w:sz="1"/>
+              <w:right w:val="single" w:color="BBBBBB" w:sz="1"/>
+            </w:tcBorders>
+            <w:shd w:fill="FFFFFF" w:val="clear"/>
+            <w:tcMar>
+              <w:top w:type="dxa" w:w="60"/>
+              <w:left w:type="dxa" w:w="100"/>
+              <w:bottom w:type="dxa" w:w="60"/>
+              <w:right w:type="dxa" w:w="100"/>
+            </w:tcMar>
+          </w:tcPr>
+          <w:p>
+            <w:r>
+              <w:rPr>
+                <w:sz w:val="18"/>
+                <w:szCs w:val="18"/>
+              </w:rPr>
+              <w:t xml:space="preserve">-</w:t>
+            </w:r>
+          </w:p>
+        </w:tc>
+        <w:tc>
+          <w:tcPr>
+            <w:tcW w:type="dxa" w:w="1872"/>
+            <w:tcBorders>
+              <w:top w:val="single" w:color="BBBBBB" w:sz="1"/>
+              <w:left w:val="single" w:color="BBBBBB" w:sz="1"/>
+              <w:bottom w:val="single" w:color="BBBBBB" w:sz="1"/>
+              <w:right w:val="single" w:color="BBBBBB" w:sz="1"/>
+            </w:tcBorders>
+            <w:shd w:fill="FFFFFF" w:val="clear"/>
+            <w:tcMar>
+              <w:top w:type="dxa" w:w="60"/>
+              <w:left w:type="dxa" w:w="100"/>
+              <w:bottom w:type="dxa" w:w="60"/>
+              <w:right w:type="dxa" w:w="100"/>
+            </w:tcMar>
+          </w:tcPr>
+          <w:p>
+            <w:r>
+              <w:rPr>
+                <w:sz w:val="18"/>
+                <w:szCs w:val="18"/>
+              </w:rPr>
+              <w:t xml:space="preserve">확인불가</w:t>
+            </w:r>
+          </w:p>
+        </w:tc>
+      </w:tr>
+      <w:tr>
+        <w:tc>
+          <w:tcPr>
+            <w:tcW w:type="dxa" w:w="1872"/>
+            <w:tcBorders>
+              <w:top w:val="single" w:color="BBBBBB" w:sz="1"/>
+              <w:left w:val="single" w:color="BBBBBB" w:sz="1"/>
+              <w:bottom w:val="single" w:color="BBBBBB" w:sz="1"/>
+              <w:right w:val="single" w:color="BBBBBB" w:sz="1"/>
+            </w:tcBorders>
+            <w:shd w:fill="FFFFFF" w:val="clear"/>
+            <w:tcMar>
+              <w:top w:type="dxa" w:w="60"/>
+              <w:left w:type="dxa" w:w="100"/>
+              <w:bottom w:type="dxa" w:w="60"/>
+              <w:right w:type="dxa" w:w="100"/>
+            </w:tcMar>
+          </w:tcPr>
+          <w:p>
+            <w:r>
+              <w:rPr>
+                <w:sz w:val="18"/>
+                <w:szCs w:val="18"/>
+              </w:rPr>
+              <w:t xml:space="preserve">US11845808B2</w:t>
+            </w:r>
+          </w:p>
+        </w:tc>
+        <w:tc>
+          <w:tcPr>
+            <w:tcW w:type="dxa" w:w="1872"/>
+            <w:tcBorders>
+              <w:top w:val="single" w:color="BBBBBB" w:sz="1"/>
+              <w:left w:val="single" w:color="BBBBBB" w:sz="1"/>
+              <w:bottom w:val="single" w:color="BBBBBB" w:sz="1"/>
+              <w:right w:val="single" w:color="BBBBBB" w:sz="1"/>
+            </w:tcBorders>
+            <w:shd w:fill="FFFFFF" w:val="clear"/>
+            <w:tcMar>
+              <w:top w:type="dxa" w:w="60"/>
+              <w:left w:type="dxa" w:w="100"/>
+              <w:bottom w:type="dxa" w:w="60"/>
+              <w:right w:type="dxa" w:w="100"/>
+            </w:tcMar>
+          </w:tcPr>
+          <w:p>
+            <w:r>
+              <w:rPr>
+                <w:sz w:val="18"/>
+                <w:szCs w:val="18"/>
+              </w:rPr>
+              <w:t xml:space="preserve">진짜패밀리</w:t>
+            </w:r>
+          </w:p>
+        </w:tc>
+        <w:tc>
+          <w:tcPr>
+            <w:tcW w:type="dxa" w:w="1872"/>
+            <w:tcBorders>
+              <w:top w:val="single" w:color="BBBBBB" w:sz="1"/>
+              <w:left w:val="single" w:color="BBBBBB" w:sz="1"/>
+              <w:bottom w:val="single" w:color="BBBBBB" w:sz="1"/>
+              <w:right w:val="single" w:color="BBBBBB" w:sz="1"/>
+            </w:tcBorders>
+            <w:shd w:fill="FFFFFF" w:val="clear"/>
+            <w:tcMar>
+              <w:top w:type="dxa" w:w="60"/>
+              <w:left w:type="dxa" w:w="100"/>
+              <w:bottom w:type="dxa" w:w="60"/>
+              <w:right w:type="dxa" w:w="100"/>
+            </w:tcMar>
+          </w:tcPr>
+          <w:p>
+            <w:r>
+              <w:rPr>
+                <w:sz w:val="18"/>
+                <w:szCs w:val="18"/>
+              </w:rPr>
+              <w:t xml:space="preserve">2020-01-15</w:t>
+            </w:r>
+          </w:p>
+        </w:tc>
+        <w:tc>
+          <w:tcPr>
+            <w:tcW w:type="dxa" w:w="1872"/>
+            <w:tcBorders>
+              <w:top w:val="single" w:color="BBBBBB" w:sz="1"/>
+              <w:left w:val="single" w:color="BBBBBB" w:sz="1"/>
+              <w:bottom w:val="single" w:color="BBBBBB" w:sz="1"/>
+              <w:right w:val="single" w:color="BBBBBB" w:sz="1"/>
+            </w:tcBorders>
+            <w:shd w:fill="FFFFFF" w:val="clear"/>
+            <w:tcMar>
+              <w:top w:type="dxa" w:w="60"/>
+              <w:left w:type="dxa" w:w="100"/>
+              <w:bottom w:type="dxa" w:w="60"/>
+              <w:right w:type="dxa" w:w="100"/>
+            </w:tcMar>
+          </w:tcPr>
+          <w:p>
+            <w:r>
+              <w:rPr>
+                <w:sz w:val="18"/>
+                <w:szCs w:val="18"/>
+              </w:rPr>
+              <w:t xml:space="preserve">우선일</w:t>
+            </w:r>
+          </w:p>
+        </w:tc>
+        <w:tc>
+          <w:tcPr>
+            <w:tcW w:type="dxa" w:w="1872"/>
+            <w:tcBorders>
+              <w:top w:val="single" w:color="BBBBBB" w:sz="1"/>
+              <w:left w:val="single" w:color="BBBBBB" w:sz="1"/>
+              <w:bottom w:val="single" w:color="BBBBBB" w:sz="1"/>
+              <w:right w:val="single" w:color="BBBBBB" w:sz="1"/>
+            </w:tcBorders>
+            <w:shd w:fill="FFFFFF" w:val="clear"/>
+            <w:tcMar>
+              <w:top w:type="dxa" w:w="60"/>
+              <w:left w:type="dxa" w:w="100"/>
+              <w:bottom w:type="dxa" w:w="60"/>
+              <w:right w:type="dxa" w:w="100"/>
+            </w:tcMar>
+          </w:tcPr>
+          <w:p>
+            <w:r>
+              <w:rPr>
+                <w:sz w:val="18"/>
+                <w:szCs w:val="18"/>
+              </w:rPr>
+              <w:t xml:space="preserve">2040-01-15  (우선일+20년; PTA/PTE 미반영)</w:t>
+            </w:r>
+          </w:p>
+        </w:tc>
+      </w:tr>
+      <w:tr>
+        <w:tc>
+          <w:tcPr>
+            <w:tcW w:type="dxa" w:w="1872"/>
+            <w:tcBorders>
+              <w:top w:val="single" w:color="BBBBBB" w:sz="1"/>
+              <w:left w:val="single" w:color="BBBBBB" w:sz="1"/>
+              <w:bottom w:val="single" w:color="BBBBBB" w:sz="1"/>
+              <w:right w:val="single" w:color="BBBBBB" w:sz="1"/>
+            </w:tcBorders>
+            <w:shd w:fill="FFFFFF" w:val="clear"/>
+            <w:tcMar>
+              <w:top w:type="dxa" w:w="60"/>
+              <w:left w:type="dxa" w:w="100"/>
+              <w:bottom w:type="dxa" w:w="60"/>
+              <w:right w:type="dxa" w:w="100"/>
+            </w:tcMar>
+          </w:tcPr>
+          <w:p>
+            <w:r>
+              <w:rPr>
+                <w:sz w:val="18"/>
+                <w:szCs w:val="18"/>
+              </w:rPr>
+              <w:t xml:space="preserve">US11884748B2</w:t>
+            </w:r>
+          </w:p>
+        </w:tc>
+        <w:tc>
+          <w:tcPr>
+            <w:tcW w:type="dxa" w:w="1872"/>
+            <w:tcBorders>
+              <w:top w:val="single" w:color="BBBBBB" w:sz="1"/>
+              <w:left w:val="single" w:color="BBBBBB" w:sz="1"/>
+              <w:bottom w:val="single" w:color="BBBBBB" w:sz="1"/>
+              <w:right w:val="single" w:color="BBBBBB" w:sz="1"/>
+            </w:tcBorders>
+            <w:shd w:fill="FFFFFF" w:val="clear"/>
+            <w:tcMar>
+              <w:top w:type="dxa" w:w="60"/>
+              <w:left w:type="dxa" w:w="100"/>
+              <w:bottom w:type="dxa" w:w="60"/>
+              <w:right w:type="dxa" w:w="100"/>
+            </w:tcMar>
+          </w:tcPr>
+          <w:p>
+            <w:r>
+              <w:rPr>
+                <w:sz w:val="18"/>
+                <w:szCs w:val="18"/>
+              </w:rPr>
+              <w:t xml:space="preserve">진짜패밀리</w:t>
+            </w:r>
+          </w:p>
+        </w:tc>
+        <w:tc>
+          <w:tcPr>
+            <w:tcW w:type="dxa" w:w="1872"/>
+            <w:tcBorders>
+              <w:top w:val="single" w:color="BBBBBB" w:sz="1"/>
+              <w:left w:val="single" w:color="BBBBBB" w:sz="1"/>
+              <w:bottom w:val="single" w:color="BBBBBB" w:sz="1"/>
+              <w:right w:val="single" w:color="BBBBBB" w:sz="1"/>
+            </w:tcBorders>
+            <w:shd w:fill="FFFFFF" w:val="clear"/>
+            <w:tcMar>
+              <w:top w:type="dxa" w:w="60"/>
+              <w:left w:type="dxa" w:w="100"/>
+              <w:bottom w:type="dxa" w:w="60"/>
+              <w:right w:type="dxa" w:w="100"/>
+            </w:tcMar>
+          </w:tcPr>
+          <w:p>
+            <w:r>
+              <w:rPr>
+                <w:sz w:val="18"/>
+                <w:szCs w:val="18"/>
+              </w:rPr>
+              <w:t xml:space="preserve">2014-07-17</w:t>
+            </w:r>
+          </w:p>
+        </w:tc>
+        <w:tc>
+          <w:tcPr>
+            <w:tcW w:type="dxa" w:w="1872"/>
+            <w:tcBorders>
+              <w:top w:val="single" w:color="BBBBBB" w:sz="1"/>
+              <w:left w:val="single" w:color="BBBBBB" w:sz="1"/>
+              <w:bottom w:val="single" w:color="BBBBBB" w:sz="1"/>
+              <w:right w:val="single" w:color="BBBBBB" w:sz="1"/>
+            </w:tcBorders>
+            <w:shd w:fill="FFFFFF" w:val="clear"/>
+            <w:tcMar>
+              <w:top w:type="dxa" w:w="60"/>
+              <w:left w:type="dxa" w:w="100"/>
+              <w:bottom w:type="dxa" w:w="60"/>
+              <w:right w:type="dxa" w:w="100"/>
+            </w:tcMar>
+          </w:tcPr>
+          <w:p>
+            <w:r>
+              <w:rPr>
+                <w:sz w:val="18"/>
+                <w:szCs w:val="18"/>
+              </w:rPr>
+              <w:t xml:space="preserve">우선일</w:t>
+            </w:r>
+          </w:p>
+        </w:tc>
+        <w:tc>
+          <w:tcPr>
+            <w:tcW w:type="dxa" w:w="1872"/>
+            <w:tcBorders>
+              <w:top w:val="single" w:color="BBBBBB" w:sz="1"/>
+              <w:left w:val="single" w:color="BBBBBB" w:sz="1"/>
+              <w:bottom w:val="single" w:color="BBBBBB" w:sz="1"/>
+              <w:right w:val="single" w:color="BBBBBB" w:sz="1"/>
+            </w:tcBorders>
+            <w:shd w:fill="FFFFFF" w:val="clear"/>
+            <w:tcMar>
+              <w:top w:type="dxa" w:w="60"/>
+              <w:left w:type="dxa" w:w="100"/>
+              <w:bottom w:type="dxa" w:w="60"/>
+              <w:right w:type="dxa" w:w="100"/>
+            </w:tcMar>
+          </w:tcPr>
+          <w:p>
+            <w:r>
+              <w:rPr>
+                <w:sz w:val="18"/>
+                <w:szCs w:val="18"/>
+              </w:rPr>
+              <w:t xml:space="preserve">2034-07-17  (우선일+20년; PTA/PTE 미반영)</w:t>
+            </w:r>
+          </w:p>
+        </w:tc>
+      </w:tr>
+      <w:tr>
+        <w:tc>
+          <w:tcPr>
+            <w:tcW w:type="dxa" w:w="1872"/>
+            <w:tcBorders>
+              <w:top w:val="single" w:color="BBBBBB" w:sz="1"/>
+              <w:left w:val="single" w:color="BBBBBB" w:sz="1"/>
+              <w:bottom w:val="single" w:color="BBBBBB" w:sz="1"/>
+              <w:right w:val="single" w:color="BBBBBB" w:sz="1"/>
+            </w:tcBorders>
+            <w:shd w:fill="FFFFFF" w:val="clear"/>
+            <w:tcMar>
+              <w:top w:type="dxa" w:w="60"/>
+              <w:left w:type="dxa" w:w="100"/>
+              <w:bottom w:type="dxa" w:w="60"/>
+              <w:right w:type="dxa" w:w="100"/>
+            </w:tcMar>
+          </w:tcPr>
+          <w:p>
+            <w:r>
+              <w:rPr>
+                <w:sz w:val="18"/>
+                <w:szCs w:val="18"/>
+              </w:rPr>
+              <w:t xml:space="preserve">US11939361B2</w:t>
+            </w:r>
+          </w:p>
+        </w:tc>
+        <w:tc>
+          <w:tcPr>
+            <w:tcW w:type="dxa" w:w="1872"/>
+            <w:tcBorders>
+              <w:top w:val="single" w:color="BBBBBB" w:sz="1"/>
+              <w:left w:val="single" w:color="BBBBBB" w:sz="1"/>
+              <w:bottom w:val="single" w:color="BBBBBB" w:sz="1"/>
+              <w:right w:val="single" w:color="BBBBBB" w:sz="1"/>
+            </w:tcBorders>
+            <w:shd w:fill="FFFFFF" w:val="clear"/>
+            <w:tcMar>
+              <w:top w:type="dxa" w:w="60"/>
+              <w:left w:type="dxa" w:w="100"/>
+              <w:bottom w:type="dxa" w:w="60"/>
+              <w:right w:type="dxa" w:w="100"/>
+            </w:tcMar>
+          </w:tcPr>
+          <w:p>
+            <w:r>
+              <w:rPr>
+                <w:sz w:val="18"/>
+                <w:szCs w:val="18"/>
+              </w:rPr>
+              <w:t xml:space="preserve">진짜패밀리</w:t>
+            </w:r>
+          </w:p>
+        </w:tc>
+        <w:tc>
+          <w:tcPr>
+            <w:tcW w:type="dxa" w:w="1872"/>
+            <w:tcBorders>
+              <w:top w:val="single" w:color="BBBBBB" w:sz="1"/>
+              <w:left w:val="single" w:color="BBBBBB" w:sz="1"/>
+              <w:bottom w:val="single" w:color="BBBBBB" w:sz="1"/>
+              <w:right w:val="single" w:color="BBBBBB" w:sz="1"/>
+            </w:tcBorders>
+            <w:shd w:fill="FFFFFF" w:val="clear"/>
+            <w:tcMar>
+              <w:top w:type="dxa" w:w="60"/>
+              <w:left w:type="dxa" w:w="100"/>
+              <w:bottom w:type="dxa" w:w="60"/>
+              <w:right w:type="dxa" w:w="100"/>
+            </w:tcMar>
+          </w:tcPr>
+          <w:p>
+            <w:r>
+              <w:rPr>
+                <w:sz w:val="18"/>
+                <w:szCs w:val="18"/>
+              </w:rPr>
+              <w:t xml:space="preserve">2020-11-20</w:t>
+            </w:r>
+          </w:p>
+        </w:tc>
+        <w:tc>
+          <w:tcPr>
+            <w:tcW w:type="dxa" w:w="1872"/>
+            <w:tcBorders>
+              <w:top w:val="single" w:color="BBBBBB" w:sz="1"/>
+              <w:left w:val="single" w:color="BBBBBB" w:sz="1"/>
+              <w:bottom w:val="single" w:color="BBBBBB" w:sz="1"/>
+              <w:right w:val="single" w:color="BBBBBB" w:sz="1"/>
+            </w:tcBorders>
+            <w:shd w:fill="FFFFFF" w:val="clear"/>
+            <w:tcMar>
+              <w:top w:type="dxa" w:w="60"/>
+              <w:left w:type="dxa" w:w="100"/>
+              <w:bottom w:type="dxa" w:w="60"/>
+              <w:right w:type="dxa" w:w="100"/>
+            </w:tcMar>
+          </w:tcPr>
+          <w:p>
+            <w:r>
+              <w:rPr>
+                <w:sz w:val="18"/>
+                <w:szCs w:val="18"/>
+              </w:rPr>
+              <w:t xml:space="preserve">우선일</w:t>
+            </w:r>
+          </w:p>
+        </w:tc>
+        <w:tc>
+          <w:tcPr>
+            <w:tcW w:type="dxa" w:w="1872"/>
+            <w:tcBorders>
+              <w:top w:val="single" w:color="BBBBBB" w:sz="1"/>
+              <w:left w:val="single" w:color="BBBBBB" w:sz="1"/>
+              <w:bottom w:val="single" w:color="BBBBBB" w:sz="1"/>
+              <w:right w:val="single" w:color="BBBBBB" w:sz="1"/>
+            </w:tcBorders>
+            <w:shd w:fill="FFFFFF" w:val="clear"/>
+            <w:tcMar>
+              <w:top w:type="dxa" w:w="60"/>
+              <w:left w:type="dxa" w:w="100"/>
+              <w:bottom w:type="dxa" w:w="60"/>
+              <w:right w:type="dxa" w:w="100"/>
+            </w:tcMar>
+          </w:tcPr>
+          <w:p>
+            <w:r>
+              <w:rPr>
+                <w:sz w:val="18"/>
+                <w:szCs w:val="18"/>
+              </w:rPr>
+              <w:t xml:space="preserve">2040-11-20  (우선일+20년; PTA/PTE 미반영)</w:t>
+            </w:r>
+          </w:p>
+        </w:tc>
+      </w:tr>
+      <w:tr>
+        <w:tc>
+          <w:tcPr>
+            <w:tcW w:type="dxa" w:w="1872"/>
+            <w:tcBorders>
+              <w:top w:val="single" w:color="BBBBBB" w:sz="1"/>
+              <w:left w:val="single" w:color="BBBBBB" w:sz="1"/>
+              <w:bottom w:val="single" w:color="BBBBBB" w:sz="1"/>
+              <w:right w:val="single" w:color="BBBBBB" w:sz="1"/>
+            </w:tcBorders>
+            <w:shd w:fill="FFFFFF" w:val="clear"/>
+            <w:tcMar>
+              <w:top w:type="dxa" w:w="60"/>
+              <w:left w:type="dxa" w:w="100"/>
+              <w:bottom w:type="dxa" w:w="60"/>
+              <w:right w:type="dxa" w:w="100"/>
+            </w:tcMar>
+          </w:tcPr>
+          <w:p>
+            <w:r>
+              <w:rPr>
+                <w:sz w:val="18"/>
+                <w:szCs w:val="18"/>
+              </w:rPr>
+              <w:t xml:space="preserve">US12018057B2</w:t>
+            </w:r>
+          </w:p>
+        </w:tc>
+        <w:tc>
+          <w:tcPr>
+            <w:tcW w:type="dxa" w:w="1872"/>
+            <w:tcBorders>
+              <w:top w:val="single" w:color="BBBBBB" w:sz="1"/>
+              <w:left w:val="single" w:color="BBBBBB" w:sz="1"/>
+              <w:bottom w:val="single" w:color="BBBBBB" w:sz="1"/>
+              <w:right w:val="single" w:color="BBBBBB" w:sz="1"/>
+            </w:tcBorders>
+            <w:shd w:fill="FFFFFF" w:val="clear"/>
+            <w:tcMar>
+              <w:top w:type="dxa" w:w="60"/>
+              <w:left w:type="dxa" w:w="100"/>
+              <w:bottom w:type="dxa" w:w="60"/>
+              <w:right w:type="dxa" w:w="100"/>
+            </w:tcMar>
+          </w:tcPr>
+          <w:p>
+            <w:r>
+              <w:rPr>
+                <w:sz w:val="18"/>
+                <w:szCs w:val="18"/>
+              </w:rPr>
+              <w:t xml:space="preserve">진짜패밀리</w:t>
+            </w:r>
+          </w:p>
+        </w:tc>
+        <w:tc>
+          <w:tcPr>
+            <w:tcW w:type="dxa" w:w="1872"/>
+            <w:tcBorders>
+              <w:top w:val="single" w:color="BBBBBB" w:sz="1"/>
+              <w:left w:val="single" w:color="BBBBBB" w:sz="1"/>
+              <w:bottom w:val="single" w:color="BBBBBB" w:sz="1"/>
+              <w:right w:val="single" w:color="BBBBBB" w:sz="1"/>
+            </w:tcBorders>
+            <w:shd w:fill="FFFFFF" w:val="clear"/>
+            <w:tcMar>
+              <w:top w:type="dxa" w:w="60"/>
+              <w:left w:type="dxa" w:w="100"/>
+              <w:bottom w:type="dxa" w:w="60"/>
+              <w:right w:type="dxa" w:w="100"/>
+            </w:tcMar>
+          </w:tcPr>
+          <w:p>
+            <w:r>
+              <w:rPr>
+                <w:sz w:val="18"/>
+                <w:szCs w:val="18"/>
+              </w:rPr>
+              <w:t xml:space="preserve">2020-01-15</w:t>
+            </w:r>
+          </w:p>
+        </w:tc>
+        <w:tc>
+          <w:tcPr>
+            <w:tcW w:type="dxa" w:w="1872"/>
+            <w:tcBorders>
+              <w:top w:val="single" w:color="BBBBBB" w:sz="1"/>
+              <w:left w:val="single" w:color="BBBBBB" w:sz="1"/>
+              <w:bottom w:val="single" w:color="BBBBBB" w:sz="1"/>
+              <w:right w:val="single" w:color="BBBBBB" w:sz="1"/>
+            </w:tcBorders>
+            <w:shd w:fill="FFFFFF" w:val="clear"/>
+            <w:tcMar>
+              <w:top w:type="dxa" w:w="60"/>
+              <w:left w:type="dxa" w:w="100"/>
+              <w:bottom w:type="dxa" w:w="60"/>
+              <w:right w:type="dxa" w:w="100"/>
+            </w:tcMar>
+          </w:tcPr>
+          <w:p>
+            <w:r>
+              <w:rPr>
+                <w:sz w:val="18"/>
+                <w:szCs w:val="18"/>
+              </w:rPr>
+              <w:t xml:space="preserve">우선일</w:t>
+            </w:r>
+          </w:p>
+        </w:tc>
+        <w:tc>
+          <w:tcPr>
+            <w:tcW w:type="dxa" w:w="1872"/>
+            <w:tcBorders>
+              <w:top w:val="single" w:color="BBBBBB" w:sz="1"/>
+              <w:left w:val="single" w:color="BBBBBB" w:sz="1"/>
+              <w:bottom w:val="single" w:color="BBBBBB" w:sz="1"/>
+              <w:right w:val="single" w:color="BBBBBB" w:sz="1"/>
+            </w:tcBorders>
+            <w:shd w:fill="FFFFFF" w:val="clear"/>
+            <w:tcMar>
+              <w:top w:type="dxa" w:w="60"/>
+              <w:left w:type="dxa" w:w="100"/>
+              <w:bottom w:type="dxa" w:w="60"/>
+              <w:right w:type="dxa" w:w="100"/>
+            </w:tcMar>
+          </w:tcPr>
+          <w:p>
+            <w:r>
+              <w:rPr>
+                <w:sz w:val="18"/>
+                <w:szCs w:val="18"/>
+              </w:rPr>
+              <w:t xml:space="preserve">2040-01-15  (우선일+20년; PTA/PTE 미반영)</w:t>
+            </w:r>
+          </w:p>
+        </w:tc>
+      </w:tr>
+      <w:tr>
+        <w:tc>
+          <w:tcPr>
+            <w:tcW w:type="dxa" w:w="1872"/>
+            <w:tcBorders>
+              <w:top w:val="single" w:color="BBBBBB" w:sz="1"/>
+              <w:left w:val="single" w:color="BBBBBB" w:sz="1"/>
+              <w:bottom w:val="single" w:color="BBBBBB" w:sz="1"/>
+              <w:right w:val="single" w:color="BBBBBB" w:sz="1"/>
+            </w:tcBorders>
+            <w:shd w:fill="FFFFFF" w:val="clear"/>
+            <w:tcMar>
+              <w:top w:type="dxa" w:w="60"/>
+              <w:left w:type="dxa" w:w="100"/>
+              <w:bottom w:type="dxa" w:w="60"/>
+              <w:right w:type="dxa" w:w="100"/>
+            </w:tcMar>
+          </w:tcPr>
+          <w:p>
+            <w:r>
+              <w:rPr>
+                <w:sz w:val="18"/>
+                <w:szCs w:val="18"/>
+              </w:rPr>
+              <w:t xml:space="preserve">US12478617B2</w:t>
+            </w:r>
+          </w:p>
+        </w:tc>
+        <w:tc>
+          <w:tcPr>
+            <w:tcW w:type="dxa" w:w="1872"/>
+            <w:tcBorders>
+              <w:top w:val="single" w:color="BBBBBB" w:sz="1"/>
+              <w:left w:val="single" w:color="BBBBBB" w:sz="1"/>
+              <w:bottom w:val="single" w:color="BBBBBB" w:sz="1"/>
+              <w:right w:val="single" w:color="BBBBBB" w:sz="1"/>
+            </w:tcBorders>
+            <w:shd w:fill="FFFFFF" w:val="clear"/>
+            <w:tcMar>
+              <w:top w:type="dxa" w:w="60"/>
+              <w:left w:type="dxa" w:w="100"/>
+              <w:bottom w:type="dxa" w:w="60"/>
+              <w:right w:type="dxa" w:w="100"/>
+            </w:tcMar>
+          </w:tcPr>
+          <w:p>
+            <w:r>
+              <w:rPr>
+                <w:sz w:val="18"/>
+                <w:szCs w:val="18"/>
+              </w:rPr>
+              <w:t xml:space="preserve">진짜패밀리</w:t>
+            </w:r>
+          </w:p>
+        </w:tc>
+        <w:tc>
+          <w:tcPr>
+            <w:tcW w:type="dxa" w:w="1872"/>
+            <w:tcBorders>
+              <w:top w:val="single" w:color="BBBBBB" w:sz="1"/>
+              <w:left w:val="single" w:color="BBBBBB" w:sz="1"/>
+              <w:bottom w:val="single" w:color="BBBBBB" w:sz="1"/>
+              <w:right w:val="single" w:color="BBBBBB" w:sz="1"/>
+            </w:tcBorders>
+            <w:shd w:fill="FFFFFF" w:val="clear"/>
+            <w:tcMar>
+              <w:top w:type="dxa" w:w="60"/>
+              <w:left w:type="dxa" w:w="100"/>
+              <w:bottom w:type="dxa" w:w="60"/>
+              <w:right w:type="dxa" w:w="100"/>
+            </w:tcMar>
+          </w:tcPr>
+          <w:p>
+            <w:r>
+              <w:rPr>
+                <w:sz w:val="18"/>
+                <w:szCs w:val="18"/>
+              </w:rPr>
+              <w:t xml:space="preserve">2021-07-14</w:t>
+            </w:r>
+          </w:p>
+        </w:tc>
+        <w:tc>
+          <w:tcPr>
+            <w:tcW w:type="dxa" w:w="1872"/>
+            <w:tcBorders>
+              <w:top w:val="single" w:color="BBBBBB" w:sz="1"/>
+              <w:left w:val="single" w:color="BBBBBB" w:sz="1"/>
+              <w:bottom w:val="single" w:color="BBBBBB" w:sz="1"/>
+              <w:right w:val="single" w:color="BBBBBB" w:sz="1"/>
+            </w:tcBorders>
+            <w:shd w:fill="FFFFFF" w:val="clear"/>
+            <w:tcMar>
+              <w:top w:type="dxa" w:w="60"/>
+              <w:left w:type="dxa" w:w="100"/>
+              <w:bottom w:type="dxa" w:w="60"/>
+              <w:right w:type="dxa" w:w="100"/>
+            </w:tcMar>
+          </w:tcPr>
+          <w:p>
+            <w:r>
+              <w:rPr>
+                <w:sz w:val="18"/>
+                <w:szCs w:val="18"/>
+              </w:rPr>
+              <w:t xml:space="preserve">우선일</w:t>
+            </w:r>
+          </w:p>
+        </w:tc>
+        <w:tc>
+          <w:tcPr>
+            <w:tcW w:type="dxa" w:w="1872"/>
+            <w:tcBorders>
+              <w:top w:val="single" w:color="BBBBBB" w:sz="1"/>
+              <w:left w:val="single" w:color="BBBBBB" w:sz="1"/>
+              <w:bottom w:val="single" w:color="BBBBBB" w:sz="1"/>
+              <w:right w:val="single" w:color="BBBBBB" w:sz="1"/>
+            </w:tcBorders>
+            <w:shd w:fill="FFFFFF" w:val="clear"/>
+            <w:tcMar>
+              <w:top w:type="dxa" w:w="60"/>
+              <w:left w:type="dxa" w:w="100"/>
+              <w:bottom w:type="dxa" w:w="60"/>
+              <w:right w:type="dxa" w:w="100"/>
+            </w:tcMar>
+          </w:tcPr>
+          <w:p>
+            <w:r>
+              <w:rPr>
+                <w:sz w:val="18"/>
+                <w:szCs w:val="18"/>
+              </w:rPr>
+              <w:t xml:space="preserve">2041-07-14  (우선일+20년; PTA/PTE 미반영)</w:t>
+            </w:r>
+          </w:p>
+        </w:tc>
+      </w:tr>
+      <w:tr>
+        <w:tc>
+          <w:tcPr>
+            <w:tcW w:type="dxa" w:w="1872"/>
+            <w:tcBorders>
+              <w:top w:val="single" w:color="BBBBBB" w:sz="1"/>
+              <w:left w:val="single" w:color="BBBBBB" w:sz="1"/>
+              <w:bottom w:val="single" w:color="BBBBBB" w:sz="1"/>
+              <w:right w:val="single" w:color="BBBBBB" w:sz="1"/>
+            </w:tcBorders>
+            <w:shd w:fill="FFFFFF" w:val="clear"/>
+            <w:tcMar>
+              <w:top w:type="dxa" w:w="60"/>
+              <w:left w:type="dxa" w:w="100"/>
+              <w:bottom w:type="dxa" w:w="60"/>
+              <w:right w:type="dxa" w:w="100"/>
+            </w:tcMar>
+          </w:tcPr>
+          <w:p>
+            <w:r>
+              <w:rPr>
+                <w:sz w:val="18"/>
+                <w:szCs w:val="18"/>
+              </w:rPr>
+              <w:t xml:space="preserve">US12552836B2</w:t>
+            </w:r>
+          </w:p>
+        </w:tc>
+        <w:tc>
+          <w:tcPr>
+            <w:tcW w:type="dxa" w:w="1872"/>
+            <w:tcBorders>
+              <w:top w:val="single" w:color="BBBBBB" w:sz="1"/>
+              <w:left w:val="single" w:color="BBBBBB" w:sz="1"/>
+              <w:bottom w:val="single" w:color="BBBBBB" w:sz="1"/>
+              <w:right w:val="single" w:color="BBBBBB" w:sz="1"/>
+            </w:tcBorders>
+            <w:shd w:fill="FFFFFF" w:val="clear"/>
+            <w:tcMar>
+              <w:top w:type="dxa" w:w="60"/>
+              <w:left w:type="dxa" w:w="100"/>
+              <w:bottom w:type="dxa" w:w="60"/>
+              <w:right w:type="dxa" w:w="100"/>
+            </w:tcMar>
+          </w:tcPr>
+          <w:p>
+            <w:r>
+              <w:rPr>
+                <w:sz w:val="18"/>
+                <w:szCs w:val="18"/>
+              </w:rPr>
+              <w:t xml:space="preserve">진짜패밀리</w:t>
+            </w:r>
+          </w:p>
+        </w:tc>
+        <w:tc>
+          <w:tcPr>
+            <w:tcW w:type="dxa" w:w="1872"/>
+            <w:tcBorders>
+              <w:top w:val="single" w:color="BBBBBB" w:sz="1"/>
+              <w:left w:val="single" w:color="BBBBBB" w:sz="1"/>
+              <w:bottom w:val="single" w:color="BBBBBB" w:sz="1"/>
+              <w:right w:val="single" w:color="BBBBBB" w:sz="1"/>
+            </w:tcBorders>
+            <w:shd w:fill="FFFFFF" w:val="clear"/>
+            <w:tcMar>
+              <w:top w:type="dxa" w:w="60"/>
+              <w:left w:type="dxa" w:w="100"/>
+              <w:bottom w:type="dxa" w:w="60"/>
+              <w:right w:type="dxa" w:w="100"/>
+            </w:tcMar>
+          </w:tcPr>
+          <w:p>
+            <w:r>
+              <w:rPr>
+                <w:sz w:val="18"/>
+                <w:szCs w:val="18"/>
+              </w:rPr>
+              <w:t xml:space="preserve">2018-07-12</w:t>
+            </w:r>
+          </w:p>
+        </w:tc>
+        <w:tc>
+          <w:tcPr>
+            <w:tcW w:type="dxa" w:w="1872"/>
+            <w:tcBorders>
+              <w:top w:val="single" w:color="BBBBBB" w:sz="1"/>
+              <w:left w:val="single" w:color="BBBBBB" w:sz="1"/>
+              <w:bottom w:val="single" w:color="BBBBBB" w:sz="1"/>
+              <w:right w:val="single" w:color="BBBBBB" w:sz="1"/>
+            </w:tcBorders>
+            <w:shd w:fill="FFFFFF" w:val="clear"/>
+            <w:tcMar>
+              <w:top w:type="dxa" w:w="60"/>
+              <w:left w:type="dxa" w:w="100"/>
+              <w:bottom w:type="dxa" w:w="60"/>
+              <w:right w:type="dxa" w:w="100"/>
+            </w:tcMar>
+          </w:tcPr>
+          <w:p>
+            <w:r>
+              <w:rPr>
+                <w:sz w:val="18"/>
+                <w:szCs w:val="18"/>
+              </w:rPr>
+              <w:t xml:space="preserve">우선일</w:t>
+            </w:r>
+          </w:p>
+        </w:tc>
+        <w:tc>
+          <w:tcPr>
+            <w:tcW w:type="dxa" w:w="1872"/>
+            <w:tcBorders>
+              <w:top w:val="single" w:color="BBBBBB" w:sz="1"/>
+              <w:left w:val="single" w:color="BBBBBB" w:sz="1"/>
+              <w:bottom w:val="single" w:color="BBBBBB" w:sz="1"/>
+              <w:right w:val="single" w:color="BBBBBB" w:sz="1"/>
+            </w:tcBorders>
+            <w:shd w:fill="FFFFFF" w:val="clear"/>
+            <w:tcMar>
+              <w:top w:type="dxa" w:w="60"/>
+              <w:left w:type="dxa" w:w="100"/>
+              <w:bottom w:type="dxa" w:w="60"/>
+              <w:right w:type="dxa" w:w="100"/>
+            </w:tcMar>
+          </w:tcPr>
+          <w:p>
+            <w:r>
+              <w:rPr>
+                <w:sz w:val="18"/>
+                <w:szCs w:val="18"/>
+              </w:rPr>
+              <w:t xml:space="preserve">2038-07-12  (우선일+20년; PTA/PTE 미반영)</w:t>
+            </w:r>
+          </w:p>
+        </w:tc>
+      </w:tr>
+      <w:tr>
+        <w:tc>
+          <w:tcPr>
+            <w:tcW w:type="dxa" w:w="1872"/>
+            <w:tcBorders>
+              <w:top w:val="single" w:color="BBBBBB" w:sz="1"/>
+              <w:left w:val="single" w:color="BBBBBB" w:sz="1"/>
+              <w:bottom w:val="single" w:color="BBBBBB" w:sz="1"/>
+              <w:right w:val="single" w:color="BBBBBB" w:sz="1"/>
+            </w:tcBorders>
+            <w:shd w:fill="FFFFFF" w:val="clear"/>
+            <w:tcMar>
+              <w:top w:type="dxa" w:w="60"/>
+              <w:left w:type="dxa" w:w="100"/>
+              <w:bottom w:type="dxa" w:w="60"/>
+              <w:right w:type="dxa" w:w="100"/>
+            </w:tcMar>
+          </w:tcPr>
+          <w:p>
+            <w:r>
+              <w:rPr>
+                <w:sz w:val="18"/>
+                <w:szCs w:val="18"/>
+              </w:rPr>
+              <w:t xml:space="preserve">US20210261622A1</w:t>
+            </w:r>
+          </w:p>
+        </w:tc>
+        <w:tc>
+          <w:tcPr>
+            <w:tcW w:type="dxa" w:w="1872"/>
+            <w:tcBorders>
+              <w:top w:val="single" w:color="BBBBBB" w:sz="1"/>
+              <w:left w:val="single" w:color="BBBBBB" w:sz="1"/>
+              <w:bottom w:val="single" w:color="BBBBBB" w:sz="1"/>
+              <w:right w:val="single" w:color="BBBBBB" w:sz="1"/>
+            </w:tcBorders>
+            <w:shd w:fill="FFFFFF" w:val="clear"/>
+            <w:tcMar>
+              <w:top w:type="dxa" w:w="60"/>
+              <w:left w:type="dxa" w:w="100"/>
+              <w:bottom w:type="dxa" w:w="60"/>
+              <w:right w:type="dxa" w:w="100"/>
+            </w:tcMar>
+          </w:tcPr>
+          <w:p>
+            <w:r>
+              <w:rPr>
+                <w:sz w:val="18"/>
+                <w:szCs w:val="18"/>
+              </w:rPr>
+              <w:t xml:space="preserve">진짜패밀리</w:t>
+            </w:r>
+          </w:p>
+        </w:tc>
+        <w:tc>
+          <w:tcPr>
+            <w:tcW w:type="dxa" w:w="1872"/>
+            <w:tcBorders>
+              <w:top w:val="single" w:color="BBBBBB" w:sz="1"/>
+              <w:left w:val="single" w:color="BBBBBB" w:sz="1"/>
+              <w:bottom w:val="single" w:color="BBBBBB" w:sz="1"/>
+              <w:right w:val="single" w:color="BBBBBB" w:sz="1"/>
+            </w:tcBorders>
+            <w:shd w:fill="FFFFFF" w:val="clear"/>
+            <w:tcMar>
+              <w:top w:type="dxa" w:w="60"/>
+              <w:left w:type="dxa" w:w="100"/>
+              <w:bottom w:type="dxa" w:w="60"/>
+              <w:right w:type="dxa" w:w="100"/>
+            </w:tcMar>
+          </w:tcPr>
+          <w:p>
+            <w:r>
+              <w:rPr>
+                <w:sz w:val="18"/>
+                <w:szCs w:val="18"/>
+              </w:rPr>
+              <w:t xml:space="preserve">2020-01-15</w:t>
+            </w:r>
+          </w:p>
+        </w:tc>
+        <w:tc>
+          <w:tcPr>
+            <w:tcW w:type="dxa" w:w="1872"/>
+            <w:tcBorders>
+              <w:top w:val="single" w:color="BBBBBB" w:sz="1"/>
+              <w:left w:val="single" w:color="BBBBBB" w:sz="1"/>
+              <w:bottom w:val="single" w:color="BBBBBB" w:sz="1"/>
+              <w:right w:val="single" w:color="BBBBBB" w:sz="1"/>
+            </w:tcBorders>
+            <w:shd w:fill="FFFFFF" w:val="clear"/>
+            <w:tcMar>
+              <w:top w:type="dxa" w:w="60"/>
+              <w:left w:type="dxa" w:w="100"/>
+              <w:bottom w:type="dxa" w:w="60"/>
+              <w:right w:type="dxa" w:w="100"/>
+            </w:tcMar>
+          </w:tcPr>
+          <w:p>
+            <w:r>
+              <w:rPr>
+                <w:sz w:val="18"/>
+                <w:szCs w:val="18"/>
+              </w:rPr>
+              <w:t xml:space="preserve">우선일</w:t>
+            </w:r>
+          </w:p>
+        </w:tc>
+        <w:tc>
+          <w:tcPr>
+            <w:tcW w:type="dxa" w:w="1872"/>
+            <w:tcBorders>
+              <w:top w:val="single" w:color="BBBBBB" w:sz="1"/>
+              <w:left w:val="single" w:color="BBBBBB" w:sz="1"/>
+              <w:bottom w:val="single" w:color="BBBBBB" w:sz="1"/>
+              <w:right w:val="single" w:color="BBBBBB" w:sz="1"/>
+            </w:tcBorders>
+            <w:shd w:fill="FFFFFF" w:val="clear"/>
+            <w:tcMar>
+              <w:top w:type="dxa" w:w="60"/>
+              <w:left w:type="dxa" w:w="100"/>
+              <w:bottom w:type="dxa" w:w="60"/>
+              <w:right w:type="dxa" w:w="100"/>
+            </w:tcMar>
+          </w:tcPr>
+          <w:p>
+            <w:r>
+              <w:rPr>
+                <w:sz w:val="18"/>
+                <w:szCs w:val="18"/>
+              </w:rPr>
+              <w:t xml:space="preserve">2040-01-15  (우선일+20년; PTA/PTE 미반영)</w:t>
+            </w:r>
+          </w:p>
+        </w:tc>
+      </w:tr>
+      <w:tr>
+        <w:tc>
+          <w:tcPr>
+            <w:tcW w:type="dxa" w:w="1872"/>
+            <w:tcBorders>
+              <w:top w:val="single" w:color="BBBBBB" w:sz="1"/>
+              <w:left w:val="single" w:color="BBBBBB" w:sz="1"/>
+              <w:bottom w:val="single" w:color="BBBBBB" w:sz="1"/>
+              <w:right w:val="single" w:color="BBBBBB" w:sz="1"/>
+            </w:tcBorders>
+            <w:shd w:fill="FFFFFF" w:val="clear"/>
+            <w:tcMar>
+              <w:top w:type="dxa" w:w="60"/>
+              <w:left w:type="dxa" w:w="100"/>
+              <w:bottom w:type="dxa" w:w="60"/>
+              <w:right w:type="dxa" w:w="100"/>
+            </w:tcMar>
+          </w:tcPr>
+          <w:p>
+            <w:r>
+              <w:rPr>
+                <w:sz w:val="18"/>
+                <w:szCs w:val="18"/>
+              </w:rPr>
+              <w:t xml:space="preserve">US20240173309A1</w:t>
+            </w:r>
+          </w:p>
+        </w:tc>
+        <w:tc>
+          <w:tcPr>
+            <w:tcW w:type="dxa" w:w="1872"/>
+            <w:tcBorders>
+              <w:top w:val="single" w:color="BBBBBB" w:sz="1"/>
+              <w:left w:val="single" w:color="BBBBBB" w:sz="1"/>
+              <w:bottom w:val="single" w:color="BBBBBB" w:sz="1"/>
+              <w:right w:val="single" w:color="BBBBBB" w:sz="1"/>
+            </w:tcBorders>
+            <w:shd w:fill="FFFFFF" w:val="clear"/>
+            <w:tcMar>
+              <w:top w:type="dxa" w:w="60"/>
+              <w:left w:type="dxa" w:w="100"/>
+              <w:bottom w:type="dxa" w:w="60"/>
+              <w:right w:type="dxa" w:w="100"/>
+            </w:tcMar>
+          </w:tcPr>
+          <w:p>
+            <w:r>
+              <w:rPr>
+                <w:sz w:val="18"/>
+                <w:szCs w:val="18"/>
+              </w:rPr>
+              <w:t xml:space="preserve">진짜패밀리</w:t>
+            </w:r>
+          </w:p>
+        </w:tc>
+        <w:tc>
+          <w:tcPr>
+            <w:tcW w:type="dxa" w:w="1872"/>
+            <w:tcBorders>
+              <w:top w:val="single" w:color="BBBBBB" w:sz="1"/>
+              <w:left w:val="single" w:color="BBBBBB" w:sz="1"/>
+              <w:bottom w:val="single" w:color="BBBBBB" w:sz="1"/>
+              <w:right w:val="single" w:color="BBBBBB" w:sz="1"/>
+            </w:tcBorders>
+            <w:shd w:fill="FFFFFF" w:val="clear"/>
+            <w:tcMar>
+              <w:top w:type="dxa" w:w="60"/>
+              <w:left w:type="dxa" w:w="100"/>
+              <w:bottom w:type="dxa" w:w="60"/>
+              <w:right w:type="dxa" w:w="100"/>
+            </w:tcMar>
+          </w:tcPr>
+          <w:p>
+            <w:r>
+              <w:rPr>
+                <w:sz w:val="18"/>
+                <w:szCs w:val="18"/>
+              </w:rPr>
+              <w:t xml:space="preserve">2021-07-14</w:t>
+            </w:r>
+          </w:p>
+        </w:tc>
+        <w:tc>
+          <w:tcPr>
+            <w:tcW w:type="dxa" w:w="1872"/>
+            <w:tcBorders>
+              <w:top w:val="single" w:color="BBBBBB" w:sz="1"/>
+              <w:left w:val="single" w:color="BBBBBB" w:sz="1"/>
+              <w:bottom w:val="single" w:color="BBBBBB" w:sz="1"/>
+              <w:right w:val="single" w:color="BBBBBB" w:sz="1"/>
+            </w:tcBorders>
+            <w:shd w:fill="FFFFFF" w:val="clear"/>
+            <w:tcMar>
+              <w:top w:type="dxa" w:w="60"/>
+              <w:left w:type="dxa" w:w="100"/>
+              <w:bottom w:type="dxa" w:w="60"/>
+              <w:right w:type="dxa" w:w="100"/>
+            </w:tcMar>
+          </w:tcPr>
+          <w:p>
+            <w:r>
+              <w:rPr>
+                <w:sz w:val="18"/>
+                <w:szCs w:val="18"/>
+              </w:rPr>
+              <w:t xml:space="preserve">우선일</w:t>
+            </w:r>
+          </w:p>
+        </w:tc>
+        <w:tc>
+          <w:tcPr>
+            <w:tcW w:type="dxa" w:w="1872"/>
+            <w:tcBorders>
+              <w:top w:val="single" w:color="BBBBBB" w:sz="1"/>
+              <w:left w:val="single" w:color="BBBBBB" w:sz="1"/>
+              <w:bottom w:val="single" w:color="BBBBBB" w:sz="1"/>
+              <w:right w:val="single" w:color="BBBBBB" w:sz="1"/>
+            </w:tcBorders>
+            <w:shd w:fill="FFFFFF" w:val="clear"/>
+            <w:tcMar>
+              <w:top w:type="dxa" w:w="60"/>
+              <w:left w:type="dxa" w:w="100"/>
+              <w:bottom w:type="dxa" w:w="60"/>
+              <w:right w:type="dxa" w:w="100"/>
+            </w:tcMar>
+          </w:tcPr>
+          <w:p>
+            <w:r>
+              <w:rPr>
+                <w:sz w:val="18"/>
+                <w:szCs w:val="18"/>
+              </w:rPr>
+              <w:t xml:space="preserve">2041-07-14  (우선일+20년; PTA/PTE 미반영)</w:t>
+            </w:r>
+          </w:p>
+        </w:tc>
+      </w:tr>
+      <w:tr>
+        <w:tc>
+          <w:tcPr>
+            <w:tcW w:type="dxa" w:w="1872"/>
+            <w:tcBorders>
+              <w:top w:val="single" w:color="BBBBBB" w:sz="1"/>
+              <w:left w:val="single" w:color="BBBBBB" w:sz="1"/>
+              <w:bottom w:val="single" w:color="BBBBBB" w:sz="1"/>
+              <w:right w:val="single" w:color="BBBBBB" w:sz="1"/>
+            </w:tcBorders>
+            <w:shd w:fill="FFFFFF" w:val="clear"/>
+            <w:tcMar>
+              <w:top w:type="dxa" w:w="60"/>
+              <w:left w:type="dxa" w:w="100"/>
+              <w:bottom w:type="dxa" w:w="60"/>
+              <w:right w:type="dxa" w:w="100"/>
+            </w:tcMar>
+          </w:tcPr>
+          <w:p>
+            <w:r>
+              <w:rPr>
+                <w:sz w:val="18"/>
+                <w:szCs w:val="18"/>
+              </w:rPr>
+              <w:t xml:space="preserve">US9605027B2</w:t>
+            </w:r>
+          </w:p>
+        </w:tc>
+        <w:tc>
+          <w:tcPr>
+            <w:tcW w:type="dxa" w:w="1872"/>
+            <w:tcBorders>
+              <w:top w:val="single" w:color="BBBBBB" w:sz="1"/>
+              <w:left w:val="single" w:color="BBBBBB" w:sz="1"/>
+              <w:bottom w:val="single" w:color="BBBBBB" w:sz="1"/>
+              <w:right w:val="single" w:color="BBBBBB" w:sz="1"/>
+            </w:tcBorders>
+            <w:shd w:fill="FFFFFF" w:val="clear"/>
+            <w:tcMar>
+              <w:top w:type="dxa" w:w="60"/>
+              <w:left w:type="dxa" w:w="100"/>
+              <w:bottom w:type="dxa" w:w="60"/>
+              <w:right w:type="dxa" w:w="100"/>
+            </w:tcMar>
+          </w:tcPr>
+          <w:p>
+            <w:r>
+              <w:rPr>
+                <w:sz w:val="18"/>
+                <w:szCs w:val="18"/>
+              </w:rPr>
+              <w:t xml:space="preserve">오귀속/무관</w:t>
+            </w:r>
+          </w:p>
+        </w:tc>
+        <w:tc>
+          <w:tcPr>
+            <w:tcW w:type="dxa" w:w="1872"/>
+            <w:tcBorders>
+              <w:top w:val="single" w:color="BBBBBB" w:sz="1"/>
+              <w:left w:val="single" w:color="BBBBBB" w:sz="1"/>
+              <w:bottom w:val="single" w:color="BBBBBB" w:sz="1"/>
+              <w:right w:val="single" w:color="BBBBBB" w:sz="1"/>
+            </w:tcBorders>
+            <w:shd w:fill="FFFFFF" w:val="clear"/>
+            <w:tcMar>
+              <w:top w:type="dxa" w:w="60"/>
+              <w:left w:type="dxa" w:w="100"/>
+              <w:bottom w:type="dxa" w:w="60"/>
+              <w:right w:type="dxa" w:w="100"/>
+            </w:tcMar>
+          </w:tcPr>
+          <w:p>
+            <w:r>
+              <w:rPr>
+                <w:sz w:val="18"/>
+                <w:szCs w:val="18"/>
+              </w:rPr>
+              <w:t xml:space="preserve">2011-06-14</w:t>
+            </w:r>
+          </w:p>
+        </w:tc>
+        <w:tc>
+          <w:tcPr>
+            <w:tcW w:type="dxa" w:w="1872"/>
+            <w:tcBorders>
+              <w:top w:val="single" w:color="BBBBBB" w:sz="1"/>
+              <w:left w:val="single" w:color="BBBBBB" w:sz="1"/>
+              <w:bottom w:val="single" w:color="BBBBBB" w:sz="1"/>
+              <w:right w:val="single" w:color="BBBBBB" w:sz="1"/>
+            </w:tcBorders>
+            <w:shd w:fill="FFFFFF" w:val="clear"/>
+            <w:tcMar>
+              <w:top w:type="dxa" w:w="60"/>
+              <w:left w:type="dxa" w:w="100"/>
+              <w:bottom w:type="dxa" w:w="60"/>
+              <w:right w:type="dxa" w:w="100"/>
+            </w:tcMar>
+          </w:tcPr>
+          <w:p>
+            <w:r>
+              <w:rPr>
+                <w:sz w:val="18"/>
+                <w:szCs w:val="18"/>
+              </w:rPr>
+              <w:t xml:space="preserve">우선일</w:t>
+            </w:r>
+          </w:p>
+        </w:tc>
+        <w:tc>
+          <w:tcPr>
+            <w:tcW w:type="dxa" w:w="1872"/>
+            <w:tcBorders>
+              <w:top w:val="single" w:color="BBBBBB" w:sz="1"/>
+              <w:left w:val="single" w:color="BBBBBB" w:sz="1"/>
+              <w:bottom w:val="single" w:color="BBBBBB" w:sz="1"/>
+              <w:right w:val="single" w:color="BBBBBB" w:sz="1"/>
+            </w:tcBorders>
+            <w:shd w:fill="FFFFFF" w:val="clear"/>
+            <w:tcMar>
+              <w:top w:type="dxa" w:w="60"/>
+              <w:left w:type="dxa" w:w="100"/>
+              <w:bottom w:type="dxa" w:w="60"/>
+              <w:right w:type="dxa" w:w="100"/>
+            </w:tcMar>
+          </w:tcPr>
+          <w:p>
+            <w:r>
+              <w:rPr>
+                <w:sz w:val="18"/>
+                <w:szCs w:val="18"/>
+              </w:rPr>
+              <w:t xml:space="preserve">2031-06-14  (우선일+20년; PTA/PTE 미반영)</w:t>
+            </w:r>
+          </w:p>
+        </w:tc>
+      </w:tr>
+      <w:tr>
+        <w:tc>
+          <w:tcPr>
+            <w:tcW w:type="dxa" w:w="1872"/>
+            <w:tcBorders>
+              <w:top w:val="single" w:color="BBBBBB" w:sz="1"/>
+              <w:left w:val="single" w:color="BBBBBB" w:sz="1"/>
+              <w:bottom w:val="single" w:color="BBBBBB" w:sz="1"/>
+              <w:right w:val="single" w:color="BBBBBB" w:sz="1"/>
+            </w:tcBorders>
+            <w:shd w:fill="FFFFFF" w:val="clear"/>
+            <w:tcMar>
+              <w:top w:type="dxa" w:w="60"/>
+              <w:left w:type="dxa" w:w="100"/>
+              <w:bottom w:type="dxa" w:w="60"/>
+              <w:right w:type="dxa" w:w="100"/>
+            </w:tcMar>
+          </w:tcPr>
+          <w:p>
+            <w:r>
+              <w:rPr>
+                <w:sz w:val="18"/>
+                <w:szCs w:val="18"/>
+              </w:rPr>
+              <w:t xml:space="preserve">US9624268B2</w:t>
+            </w:r>
+          </w:p>
+        </w:tc>
+        <w:tc>
+          <w:tcPr>
+            <w:tcW w:type="dxa" w:w="1872"/>
+            <w:tcBorders>
+              <w:top w:val="single" w:color="BBBBBB" w:sz="1"/>
+              <w:left w:val="single" w:color="BBBBBB" w:sz="1"/>
+              <w:bottom w:val="single" w:color="BBBBBB" w:sz="1"/>
+              <w:right w:val="single" w:color="BBBBBB" w:sz="1"/>
+            </w:tcBorders>
+            <w:shd w:fill="FFFFFF" w:val="clear"/>
+            <w:tcMar>
+              <w:top w:type="dxa" w:w="60"/>
+              <w:left w:type="dxa" w:w="100"/>
+              <w:bottom w:type="dxa" w:w="60"/>
+              <w:right w:type="dxa" w:w="100"/>
+            </w:tcMar>
+          </w:tcPr>
+          <w:p>
+            <w:r>
+              <w:rPr>
+                <w:sz w:val="18"/>
+                <w:szCs w:val="18"/>
+              </w:rPr>
+              <w:t xml:space="preserve">진짜패밀리</w:t>
+            </w:r>
+          </w:p>
+        </w:tc>
+        <w:tc>
+          <w:tcPr>
+            <w:tcW w:type="dxa" w:w="1872"/>
+            <w:tcBorders>
+              <w:top w:val="single" w:color="BBBBBB" w:sz="1"/>
+              <w:left w:val="single" w:color="BBBBBB" w:sz="1"/>
+              <w:bottom w:val="single" w:color="BBBBBB" w:sz="1"/>
+              <w:right w:val="single" w:color="BBBBBB" w:sz="1"/>
+            </w:tcBorders>
+            <w:shd w:fill="FFFFFF" w:val="clear"/>
+            <w:tcMar>
+              <w:top w:type="dxa" w:w="60"/>
+              <w:left w:type="dxa" w:w="100"/>
+              <w:bottom w:type="dxa" w:w="60"/>
+              <w:right w:type="dxa" w:w="100"/>
+            </w:tcMar>
+          </w:tcPr>
+          <w:p>
+            <w:r>
+              <w:rPr>
+                <w:sz w:val="18"/>
+                <w:szCs w:val="18"/>
+              </w:rPr>
+              <w:t xml:space="preserve">2014-07-17</w:t>
+            </w:r>
+          </w:p>
+        </w:tc>
+        <w:tc>
+          <w:tcPr>
+            <w:tcW w:type="dxa" w:w="1872"/>
+            <w:tcBorders>
+              <w:top w:val="single" w:color="BBBBBB" w:sz="1"/>
+              <w:left w:val="single" w:color="BBBBBB" w:sz="1"/>
+              <w:bottom w:val="single" w:color="BBBBBB" w:sz="1"/>
+              <w:right w:val="single" w:color="BBBBBB" w:sz="1"/>
+            </w:tcBorders>
+            <w:shd w:fill="FFFFFF" w:val="clear"/>
+            <w:tcMar>
+              <w:top w:type="dxa" w:w="60"/>
+              <w:left w:type="dxa" w:w="100"/>
+              <w:bottom w:type="dxa" w:w="60"/>
+              <w:right w:type="dxa" w:w="100"/>
+            </w:tcMar>
+          </w:tcPr>
+          <w:p>
+            <w:r>
+              <w:rPr>
+                <w:sz w:val="18"/>
+                <w:szCs w:val="18"/>
+              </w:rPr>
+              <w:t xml:space="preserve">우선일</w:t>
+            </w:r>
+          </w:p>
+        </w:tc>
+        <w:tc>
+          <w:tcPr>
+            <w:tcW w:type="dxa" w:w="1872"/>
+            <w:tcBorders>
+              <w:top w:val="single" w:color="BBBBBB" w:sz="1"/>
+              <w:left w:val="single" w:color="BBBBBB" w:sz="1"/>
+              <w:bottom w:val="single" w:color="BBBBBB" w:sz="1"/>
+              <w:right w:val="single" w:color="BBBBBB" w:sz="1"/>
+            </w:tcBorders>
+            <w:shd w:fill="FFFFFF" w:val="clear"/>
+            <w:tcMar>
+              <w:top w:type="dxa" w:w="60"/>
+              <w:left w:type="dxa" w:w="100"/>
+              <w:bottom w:type="dxa" w:w="60"/>
+              <w:right w:type="dxa" w:w="100"/>
+            </w:tcMar>
+          </w:tcPr>
+          <w:p>
+            <w:r>
+              <w:rPr>
+                <w:sz w:val="18"/>
+                <w:szCs w:val="18"/>
+              </w:rPr>
+              <w:t xml:space="preserve">2034-07-17  (우선일+20년; PTA/PTE 미반영)</w:t>
+            </w:r>
+          </w:p>
+        </w:tc>
+      </w:tr>
+      <w:tr>
+        <w:tc>
+          <w:tcPr>
+            <w:tcW w:type="dxa" w:w="1872"/>
+            <w:tcBorders>
+              <w:top w:val="single" w:color="BBBBBB" w:sz="1"/>
+              <w:left w:val="single" w:color="BBBBBB" w:sz="1"/>
+              <w:bottom w:val="single" w:color="BBBBBB" w:sz="1"/>
+              <w:right w:val="single" w:color="BBBBBB" w:sz="1"/>
+            </w:tcBorders>
+            <w:shd w:fill="FFFFFF" w:val="clear"/>
+            <w:tcMar>
+              <w:top w:type="dxa" w:w="60"/>
+              <w:left w:type="dxa" w:w="100"/>
+              <w:bottom w:type="dxa" w:w="60"/>
+              <w:right w:type="dxa" w:w="100"/>
+            </w:tcMar>
+          </w:tcPr>
+          <w:p>
+            <w:r>
+              <w:rPr>
+                <w:sz w:val="18"/>
+                <w:szCs w:val="18"/>
+              </w:rPr>
+              <w:t xml:space="preserve">USRE49026E1</w:t>
+            </w:r>
+          </w:p>
+        </w:tc>
+        <w:tc>
+          <w:tcPr>
+            <w:tcW w:type="dxa" w:w="1872"/>
+            <w:tcBorders>
+              <w:top w:val="single" w:color="BBBBBB" w:sz="1"/>
+              <w:left w:val="single" w:color="BBBBBB" w:sz="1"/>
+              <w:bottom w:val="single" w:color="BBBBBB" w:sz="1"/>
+              <w:right w:val="single" w:color="BBBBBB" w:sz="1"/>
+            </w:tcBorders>
+            <w:shd w:fill="FFFFFF" w:val="clear"/>
+            <w:tcMar>
+              <w:top w:type="dxa" w:w="60"/>
+              <w:left w:type="dxa" w:w="100"/>
+              <w:bottom w:type="dxa" w:w="60"/>
+              <w:right w:type="dxa" w:w="100"/>
+            </w:tcMar>
+          </w:tcPr>
+          <w:p>
+            <w:r>
+              <w:rPr>
+                <w:sz w:val="18"/>
+                <w:szCs w:val="18"/>
+              </w:rPr>
+              <w:t xml:space="preserve">오귀속/무관</w:t>
+            </w:r>
+          </w:p>
+        </w:tc>
+        <w:tc>
+          <w:tcPr>
+            <w:tcW w:type="dxa" w:w="1872"/>
+            <w:tcBorders>
+              <w:top w:val="single" w:color="BBBBBB" w:sz="1"/>
+              <w:left w:val="single" w:color="BBBBBB" w:sz="1"/>
+              <w:bottom w:val="single" w:color="BBBBBB" w:sz="1"/>
+              <w:right w:val="single" w:color="BBBBBB" w:sz="1"/>
+            </w:tcBorders>
+            <w:shd w:fill="FFFFFF" w:val="clear"/>
+            <w:tcMar>
+              <w:top w:type="dxa" w:w="60"/>
+              <w:left w:type="dxa" w:w="100"/>
+              <w:bottom w:type="dxa" w:w="60"/>
+              <w:right w:type="dxa" w:w="100"/>
+            </w:tcMar>
+          </w:tcPr>
+          <w:p>
+            <w:r>
+              <w:rPr>
+                <w:sz w:val="18"/>
+                <w:szCs w:val="18"/>
+              </w:rPr>
+              <w:t xml:space="preserve">2011-06-14</w:t>
+            </w:r>
+          </w:p>
+        </w:tc>
+        <w:tc>
+          <w:tcPr>
+            <w:tcW w:type="dxa" w:w="1872"/>
+            <w:tcBorders>
+              <w:top w:val="single" w:color="BBBBBB" w:sz="1"/>
+              <w:left w:val="single" w:color="BBBBBB" w:sz="1"/>
+              <w:bottom w:val="single" w:color="BBBBBB" w:sz="1"/>
+              <w:right w:val="single" w:color="BBBBBB" w:sz="1"/>
+            </w:tcBorders>
+            <w:shd w:fill="FFFFFF" w:val="clear"/>
+            <w:tcMar>
+              <w:top w:type="dxa" w:w="60"/>
+              <w:left w:type="dxa" w:w="100"/>
+              <w:bottom w:type="dxa" w:w="60"/>
+              <w:right w:type="dxa" w:w="100"/>
+            </w:tcMar>
+          </w:tcPr>
+          <w:p>
+            <w:r>
+              <w:rPr>
+                <w:sz w:val="18"/>
+                <w:szCs w:val="18"/>
+              </w:rPr>
+              <w:t xml:space="preserve">우선일</w:t>
+            </w:r>
+          </w:p>
+        </w:tc>
+        <w:tc>
+          <w:tcPr>
+            <w:tcW w:type="dxa" w:w="1872"/>
+            <w:tcBorders>
+              <w:top w:val="single" w:color="BBBBBB" w:sz="1"/>
+              <w:left w:val="single" w:color="BBBBBB" w:sz="1"/>
+              <w:bottom w:val="single" w:color="BBBBBB" w:sz="1"/>
+              <w:right w:val="single" w:color="BBBBBB" w:sz="1"/>
+            </w:tcBorders>
+            <w:shd w:fill="FFFFFF" w:val="clear"/>
+            <w:tcMar>
+              <w:top w:type="dxa" w:w="60"/>
+              <w:left w:type="dxa" w:w="100"/>
+              <w:bottom w:type="dxa" w:w="60"/>
+              <w:right w:type="dxa" w:w="100"/>
+            </w:tcMar>
+          </w:tcPr>
+          <w:p>
+            <w:r>
+              <w:rPr>
+                <w:sz w:val="18"/>
+                <w:szCs w:val="18"/>
+              </w:rPr>
+              <w:t xml:space="preserve">2031-06-14  (우선일+20년; PTA/PTE 미반영)</w:t>
+            </w:r>
+          </w:p>
+        </w:tc>
+      </w:tr>
+      <w:tr>
+        <w:tc>
+          <w:tcPr>
+            <w:tcW w:type="dxa" w:w="1872"/>
+            <w:tcBorders>
+              <w:top w:val="single" w:color="BBBBBB" w:sz="1"/>
+              <w:left w:val="single" w:color="BBBBBB" w:sz="1"/>
+              <w:bottom w:val="single" w:color="BBBBBB" w:sz="1"/>
+              <w:right w:val="single" w:color="BBBBBB" w:sz="1"/>
+            </w:tcBorders>
+            <w:shd w:fill="FFFFFF" w:val="clear"/>
+            <w:tcMar>
+              <w:top w:type="dxa" w:w="60"/>
+              <w:left w:type="dxa" w:w="100"/>
+              <w:bottom w:type="dxa" w:w="60"/>
+              <w:right w:type="dxa" w:w="100"/>
+            </w:tcMar>
+          </w:tcPr>
+          <w:p>
+            <w:r>
+              <w:rPr>
+                <w:sz w:val="18"/>
+                <w:szCs w:val="18"/>
+              </w:rPr>
+              <w:t xml:space="preserve">WO2016011208A1</w:t>
+            </w:r>
+          </w:p>
+        </w:tc>
+        <w:tc>
+          <w:tcPr>
+            <w:tcW w:type="dxa" w:w="1872"/>
+            <w:tcBorders>
+              <w:top w:val="single" w:color="BBBBBB" w:sz="1"/>
+              <w:left w:val="single" w:color="BBBBBB" w:sz="1"/>
+              <w:bottom w:val="single" w:color="BBBBBB" w:sz="1"/>
+              <w:right w:val="single" w:color="BBBBBB" w:sz="1"/>
+            </w:tcBorders>
+            <w:shd w:fill="FFFFFF" w:val="clear"/>
+            <w:tcMar>
+              <w:top w:type="dxa" w:w="60"/>
+              <w:left w:type="dxa" w:w="100"/>
+              <w:bottom w:type="dxa" w:w="60"/>
+              <w:right w:type="dxa" w:w="100"/>
+            </w:tcMar>
+          </w:tcPr>
+          <w:p>
+            <w:r>
+              <w:rPr>
+                <w:sz w:val="18"/>
+                <w:szCs w:val="18"/>
+              </w:rPr>
+              <w:t xml:space="preserve">진짜패밀리</w:t>
+            </w:r>
+          </w:p>
+        </w:tc>
+        <w:tc>
+          <w:tcPr>
+            <w:tcW w:type="dxa" w:w="1872"/>
+            <w:tcBorders>
+              <w:top w:val="single" w:color="BBBBBB" w:sz="1"/>
+              <w:left w:val="single" w:color="BBBBBB" w:sz="1"/>
+              <w:bottom w:val="single" w:color="BBBBBB" w:sz="1"/>
+              <w:right w:val="single" w:color="BBBBBB" w:sz="1"/>
+            </w:tcBorders>
+            <w:shd w:fill="FFFFFF" w:val="clear"/>
+            <w:tcMar>
+              <w:top w:type="dxa" w:w="60"/>
+              <w:left w:type="dxa" w:w="100"/>
+              <w:bottom w:type="dxa" w:w="60"/>
+              <w:right w:type="dxa" w:w="100"/>
+            </w:tcMar>
+          </w:tcPr>
+          <w:p>
+            <w:r>
+              <w:rPr>
+                <w:sz w:val="18"/>
+                <w:szCs w:val="18"/>
+              </w:rPr>
+              <w:t xml:space="preserve">2014-07-17</w:t>
+            </w:r>
+          </w:p>
+        </w:tc>
+        <w:tc>
+          <w:tcPr>
+            <w:tcW w:type="dxa" w:w="1872"/>
+            <w:tcBorders>
+              <w:top w:val="single" w:color="BBBBBB" w:sz="1"/>
+              <w:left w:val="single" w:color="BBBBBB" w:sz="1"/>
+              <w:bottom w:val="single" w:color="BBBBBB" w:sz="1"/>
+              <w:right w:val="single" w:color="BBBBBB" w:sz="1"/>
+            </w:tcBorders>
+            <w:shd w:fill="FFFFFF" w:val="clear"/>
+            <w:tcMar>
+              <w:top w:type="dxa" w:w="60"/>
+              <w:left w:type="dxa" w:w="100"/>
+              <w:bottom w:type="dxa" w:w="60"/>
+              <w:right w:type="dxa" w:w="100"/>
+            </w:tcMar>
+          </w:tcPr>
+          <w:p>
+            <w:r>
+              <w:rPr>
+                <w:sz w:val="18"/>
+                <w:szCs w:val="18"/>
+              </w:rPr>
+              <w:t xml:space="preserve">우선일</w:t>
+            </w:r>
+          </w:p>
+        </w:tc>
+        <w:tc>
+          <w:tcPr>
+            <w:tcW w:type="dxa" w:w="1872"/>
+            <w:tcBorders>
+              <w:top w:val="single" w:color="BBBBBB" w:sz="1"/>
+              <w:left w:val="single" w:color="BBBBBB" w:sz="1"/>
+              <w:bottom w:val="single" w:color="BBBBBB" w:sz="1"/>
+              <w:right w:val="single" w:color="BBBBBB" w:sz="1"/>
+            </w:tcBorders>
+            <w:shd w:fill="FFFFFF" w:val="clear"/>
+            <w:tcMar>
+              <w:top w:type="dxa" w:w="60"/>
+              <w:left w:type="dxa" w:w="100"/>
+              <w:bottom w:type="dxa" w:w="60"/>
+              <w:right w:type="dxa" w:w="100"/>
+            </w:tcMar>
+          </w:tcPr>
+          <w:p>
+            <w:r>
+              <w:rPr>
+                <w:sz w:val="18"/>
+                <w:szCs w:val="18"/>
+              </w:rPr>
+              <w:t xml:space="preserve">2034-07-17  (우선일+20년; PTA/PTE 미반영)</w:t>
+            </w:r>
+          </w:p>
+        </w:tc>
+      </w:tr>
+      <w:tr>
+        <w:tc>
+          <w:tcPr>
+            <w:tcW w:type="dxa" w:w="1872"/>
+            <w:tcBorders>
+              <w:top w:val="single" w:color="BBBBBB" w:sz="1"/>
+              <w:left w:val="single" w:color="BBBBBB" w:sz="1"/>
+              <w:bottom w:val="single" w:color="BBBBBB" w:sz="1"/>
+              <w:right w:val="single" w:color="BBBBBB" w:sz="1"/>
+            </w:tcBorders>
+            <w:shd w:fill="FFFFFF" w:val="clear"/>
+            <w:tcMar>
+              <w:top w:type="dxa" w:w="60"/>
+              <w:left w:type="dxa" w:w="100"/>
+              <w:bottom w:type="dxa" w:w="60"/>
+              <w:right w:type="dxa" w:w="100"/>
+            </w:tcMar>
+          </w:tcPr>
+          <w:p>
+            <w:r>
+              <w:rPr>
+                <w:sz w:val="18"/>
+                <w:szCs w:val="18"/>
+              </w:rPr>
+              <w:t xml:space="preserve">WO2021146441A1</w:t>
+            </w:r>
+          </w:p>
+        </w:tc>
+        <w:tc>
+          <w:tcPr>
+            <w:tcW w:type="dxa" w:w="1872"/>
+            <w:tcBorders>
+              <w:top w:val="single" w:color="BBBBBB" w:sz="1"/>
+              <w:left w:val="single" w:color="BBBBBB" w:sz="1"/>
+              <w:bottom w:val="single" w:color="BBBBBB" w:sz="1"/>
+              <w:right w:val="single" w:color="BBBBBB" w:sz="1"/>
+            </w:tcBorders>
+            <w:shd w:fill="FFFFFF" w:val="clear"/>
+            <w:tcMar>
+              <w:top w:type="dxa" w:w="60"/>
+              <w:left w:type="dxa" w:w="100"/>
+              <w:bottom w:type="dxa" w:w="60"/>
+              <w:right w:type="dxa" w:w="100"/>
+            </w:tcMar>
+          </w:tcPr>
+          <w:p>
+            <w:r>
+              <w:rPr>
+                <w:sz w:val="18"/>
+                <w:szCs w:val="18"/>
+              </w:rPr>
+              <w:t xml:space="preserve">진짜패밀리</w:t>
+            </w:r>
+          </w:p>
+        </w:tc>
+        <w:tc>
+          <w:tcPr>
+            <w:tcW w:type="dxa" w:w="1872"/>
+            <w:tcBorders>
+              <w:top w:val="single" w:color="BBBBBB" w:sz="1"/>
+              <w:left w:val="single" w:color="BBBBBB" w:sz="1"/>
+              <w:bottom w:val="single" w:color="BBBBBB" w:sz="1"/>
+              <w:right w:val="single" w:color="BBBBBB" w:sz="1"/>
+            </w:tcBorders>
+            <w:shd w:fill="FFFFFF" w:val="clear"/>
+            <w:tcMar>
+              <w:top w:type="dxa" w:w="60"/>
+              <w:left w:type="dxa" w:w="100"/>
+              <w:bottom w:type="dxa" w:w="60"/>
+              <w:right w:type="dxa" w:w="100"/>
+            </w:tcMar>
+          </w:tcPr>
+          <w:p>
+            <w:r>
+              <w:rPr>
+                <w:sz w:val="18"/>
+                <w:szCs w:val="18"/>
+              </w:rPr>
+              <w:t xml:space="preserve">2021-01-14</w:t>
+            </w:r>
+          </w:p>
+        </w:tc>
+        <w:tc>
+          <w:tcPr>
+            <w:tcW w:type="dxa" w:w="1872"/>
+            <w:tcBorders>
+              <w:top w:val="single" w:color="BBBBBB" w:sz="1"/>
+              <w:left w:val="single" w:color="BBBBBB" w:sz="1"/>
+              <w:bottom w:val="single" w:color="BBBBBB" w:sz="1"/>
+              <w:right w:val="single" w:color="BBBBBB" w:sz="1"/>
+            </w:tcBorders>
+            <w:shd w:fill="FFFFFF" w:val="clear"/>
+            <w:tcMar>
+              <w:top w:type="dxa" w:w="60"/>
+              <w:left w:type="dxa" w:w="100"/>
+              <w:bottom w:type="dxa" w:w="60"/>
+              <w:right w:type="dxa" w:w="100"/>
+            </w:tcMar>
+          </w:tcPr>
+          <w:p>
+            <w:r>
+              <w:rPr>
+                <w:sz w:val="18"/>
+                <w:szCs w:val="18"/>
+              </w:rPr>
+              <w:t xml:space="preserve">출원일</w:t>
+            </w:r>
+          </w:p>
+        </w:tc>
+        <w:tc>
+          <w:tcPr>
+            <w:tcW w:type="dxa" w:w="1872"/>
+            <w:tcBorders>
+              <w:top w:val="single" w:color="BBBBBB" w:sz="1"/>
+              <w:left w:val="single" w:color="BBBBBB" w:sz="1"/>
+              <w:bottom w:val="single" w:color="BBBBBB" w:sz="1"/>
+              <w:right w:val="single" w:color="BBBBBB" w:sz="1"/>
+            </w:tcBorders>
+            <w:shd w:fill="FFFFFF" w:val="clear"/>
+            <w:tcMar>
+              <w:top w:type="dxa" w:w="60"/>
+              <w:left w:type="dxa" w:w="100"/>
+              <w:bottom w:type="dxa" w:w="60"/>
+              <w:right w:type="dxa" w:w="100"/>
+            </w:tcMar>
+          </w:tcPr>
+          <w:p>
+            <w:r>
+              <w:rPr>
+                <w:sz w:val="18"/>
+                <w:szCs w:val="18"/>
+              </w:rPr>
+              <w:t xml:space="preserve">2041-01-14  (출원일+20년; PTA/PTE 미반영)</w:t>
+            </w:r>
+          </w:p>
+        </w:tc>
+      </w:tr>
+      <w:tr>
+        <w:tc>
+          <w:tcPr>
+            <w:tcW w:type="dxa" w:w="1872"/>
+            <w:tcBorders>
+              <w:top w:val="single" w:color="BBBBBB" w:sz="1"/>
+              <w:left w:val="single" w:color="BBBBBB" w:sz="1"/>
+              <w:bottom w:val="single" w:color="BBBBBB" w:sz="1"/>
+              <w:right w:val="single" w:color="BBBBBB" w:sz="1"/>
+            </w:tcBorders>
+            <w:shd w:fill="FFFFFF" w:val="clear"/>
+            <w:tcMar>
+              <w:top w:type="dxa" w:w="60"/>
+              <w:left w:type="dxa" w:w="100"/>
+              <w:bottom w:type="dxa" w:w="60"/>
+              <w:right w:type="dxa" w:w="100"/>
+            </w:tcMar>
+          </w:tcPr>
+          <w:p>
+            <w:r>
+              <w:rPr>
+                <w:sz w:val="18"/>
+                <w:szCs w:val="18"/>
+              </w:rPr>
+              <w:t xml:space="preserve">WO2023099669A1</w:t>
+            </w:r>
+          </w:p>
+        </w:tc>
+        <w:tc>
+          <w:tcPr>
+            <w:tcW w:type="dxa" w:w="1872"/>
+            <w:tcBorders>
+              <w:top w:val="single" w:color="BBBBBB" w:sz="1"/>
+              <w:left w:val="single" w:color="BBBBBB" w:sz="1"/>
+              <w:bottom w:val="single" w:color="BBBBBB" w:sz="1"/>
+              <w:right w:val="single" w:color="BBBBBB" w:sz="1"/>
+            </w:tcBorders>
+            <w:shd w:fill="FFFFFF" w:val="clear"/>
+            <w:tcMar>
+              <w:top w:type="dxa" w:w="60"/>
+              <w:left w:type="dxa" w:w="100"/>
+              <w:bottom w:type="dxa" w:w="60"/>
+              <w:right w:type="dxa" w:w="100"/>
+            </w:tcMar>
+          </w:tcPr>
+          <w:p>
+            <w:r>
+              <w:rPr>
+                <w:sz w:val="18"/>
+                <w:szCs w:val="18"/>
+              </w:rPr>
+              <w:t xml:space="preserve">오귀속/무관</w:t>
+            </w:r>
+          </w:p>
+        </w:tc>
+        <w:tc>
+          <w:tcPr>
+            <w:tcW w:type="dxa" w:w="1872"/>
+            <w:tcBorders>
+              <w:top w:val="single" w:color="BBBBBB" w:sz="1"/>
+              <w:left w:val="single" w:color="BBBBBB" w:sz="1"/>
+              <w:bottom w:val="single" w:color="BBBBBB" w:sz="1"/>
+              <w:right w:val="single" w:color="BBBBBB" w:sz="1"/>
+            </w:tcBorders>
+            <w:shd w:fill="FFFFFF" w:val="clear"/>
+            <w:tcMar>
+              <w:top w:type="dxa" w:w="60"/>
+              <w:left w:type="dxa" w:w="100"/>
+              <w:bottom w:type="dxa" w:w="60"/>
+              <w:right w:type="dxa" w:w="100"/>
+            </w:tcMar>
+          </w:tcPr>
+          <w:p>
+            <w:r>
+              <w:rPr>
+                <w:sz w:val="18"/>
+                <w:szCs w:val="18"/>
+              </w:rPr>
+              <w:t xml:space="preserve">2022-12-01</w:t>
+            </w:r>
+          </w:p>
+        </w:tc>
+        <w:tc>
+          <w:tcPr>
+            <w:tcW w:type="dxa" w:w="1872"/>
+            <w:tcBorders>
+              <w:top w:val="single" w:color="BBBBBB" w:sz="1"/>
+              <w:left w:val="single" w:color="BBBBBB" w:sz="1"/>
+              <w:bottom w:val="single" w:color="BBBBBB" w:sz="1"/>
+              <w:right w:val="single" w:color="BBBBBB" w:sz="1"/>
+            </w:tcBorders>
+            <w:shd w:fill="FFFFFF" w:val="clear"/>
+            <w:tcMar>
+              <w:top w:type="dxa" w:w="60"/>
+              <w:left w:type="dxa" w:w="100"/>
+              <w:bottom w:type="dxa" w:w="60"/>
+              <w:right w:type="dxa" w:w="100"/>
+            </w:tcMar>
+          </w:tcPr>
+          <w:p>
+            <w:r>
+              <w:rPr>
+                <w:sz w:val="18"/>
+                <w:szCs w:val="18"/>
+              </w:rPr>
+              <w:t xml:space="preserve">출원일</w:t>
+            </w:r>
+          </w:p>
+        </w:tc>
+        <w:tc>
+          <w:tcPr>
+            <w:tcW w:type="dxa" w:w="1872"/>
+            <w:tcBorders>
+              <w:top w:val="single" w:color="BBBBBB" w:sz="1"/>
+              <w:left w:val="single" w:color="BBBBBB" w:sz="1"/>
+              <w:bottom w:val="single" w:color="BBBBBB" w:sz="1"/>
+              <w:right w:val="single" w:color="BBBBBB" w:sz="1"/>
+            </w:tcBorders>
+            <w:shd w:fill="FFFFFF" w:val="clear"/>
+            <w:tcMar>
+              <w:top w:type="dxa" w:w="60"/>
+              <w:left w:type="dxa" w:w="100"/>
+              <w:bottom w:type="dxa" w:w="60"/>
+              <w:right w:type="dxa" w:w="100"/>
+            </w:tcMar>
+          </w:tcPr>
+          <w:p>
+            <w:r>
+              <w:rPr>
+                <w:sz w:val="18"/>
+                <w:szCs w:val="18"/>
+              </w:rPr>
+              <w:t xml:space="preserve">2042-12-01  (출원일+20년; PTA/PTE 미반영)</w:t>
+            </w:r>
+          </w:p>
+        </w:tc>
+      </w:tr>
+      <w:tr>
+        <w:tc>
+          <w:tcPr>
+            <w:tcW w:type="dxa" w:w="1872"/>
+            <w:tcBorders>
+              <w:top w:val="single" w:color="BBBBBB" w:sz="1"/>
+              <w:left w:val="single" w:color="BBBBBB" w:sz="1"/>
+              <w:bottom w:val="single" w:color="BBBBBB" w:sz="1"/>
+              <w:right w:val="single" w:color="BBBBBB" w:sz="1"/>
+            </w:tcBorders>
+            <w:shd w:fill="FFFFFF" w:val="clear"/>
+            <w:tcMar>
+              <w:top w:type="dxa" w:w="60"/>
+              <w:left w:type="dxa" w:w="100"/>
+              <w:bottom w:type="dxa" w:w="60"/>
+              <w:right w:type="dxa" w:w="100"/>
+            </w:tcMar>
+          </w:tcPr>
+          <w:p>
+            <w:r>
+              <w:rPr>
+                <w:sz w:val="18"/>
+                <w:szCs w:val="18"/>
+              </w:rPr>
+              <w:t xml:space="preserve">WO2023212427A1</w:t>
+            </w:r>
+          </w:p>
+        </w:tc>
+        <w:tc>
+          <w:tcPr>
+            <w:tcW w:type="dxa" w:w="1872"/>
+            <w:tcBorders>
+              <w:top w:val="single" w:color="BBBBBB" w:sz="1"/>
+              <w:left w:val="single" w:color="BBBBBB" w:sz="1"/>
+              <w:bottom w:val="single" w:color="BBBBBB" w:sz="1"/>
+              <w:right w:val="single" w:color="BBBBBB" w:sz="1"/>
+            </w:tcBorders>
+            <w:shd w:fill="FFFFFF" w:val="clear"/>
+            <w:tcMar>
+              <w:top w:type="dxa" w:w="60"/>
+              <w:left w:type="dxa" w:w="100"/>
+              <w:bottom w:type="dxa" w:w="60"/>
+              <w:right w:type="dxa" w:w="100"/>
+            </w:tcMar>
+          </w:tcPr>
+          <w:p>
+            <w:r>
+              <w:rPr>
+                <w:sz w:val="18"/>
+                <w:szCs w:val="18"/>
+              </w:rPr>
+              <w:t xml:space="preserve">오귀속/무관</w:t>
+            </w:r>
+          </w:p>
+        </w:tc>
+        <w:tc>
+          <w:tcPr>
+            <w:tcW w:type="dxa" w:w="1872"/>
+            <w:tcBorders>
+              <w:top w:val="single" w:color="BBBBBB" w:sz="1"/>
+              <w:left w:val="single" w:color="BBBBBB" w:sz="1"/>
+              <w:bottom w:val="single" w:color="BBBBBB" w:sz="1"/>
+              <w:right w:val="single" w:color="BBBBBB" w:sz="1"/>
+            </w:tcBorders>
+            <w:shd w:fill="FFFFFF" w:val="clear"/>
+            <w:tcMar>
+              <w:top w:type="dxa" w:w="60"/>
+              <w:left w:type="dxa" w:w="100"/>
+              <w:bottom w:type="dxa" w:w="60"/>
+              <w:right w:type="dxa" w:w="100"/>
+            </w:tcMar>
+          </w:tcPr>
+          <w:p>
+            <w:r>
+              <w:rPr>
+                <w:sz w:val="18"/>
+                <w:szCs w:val="18"/>
+              </w:rPr>
+              <w:t xml:space="preserve">2023-01-19</w:t>
+            </w:r>
+          </w:p>
+        </w:tc>
+        <w:tc>
+          <w:tcPr>
+            <w:tcW w:type="dxa" w:w="1872"/>
+            <w:tcBorders>
+              <w:top w:val="single" w:color="BBBBBB" w:sz="1"/>
+              <w:left w:val="single" w:color="BBBBBB" w:sz="1"/>
+              <w:bottom w:val="single" w:color="BBBBBB" w:sz="1"/>
+              <w:right w:val="single" w:color="BBBBBB" w:sz="1"/>
+            </w:tcBorders>
+            <w:shd w:fill="FFFFFF" w:val="clear"/>
+            <w:tcMar>
+              <w:top w:type="dxa" w:w="60"/>
+              <w:left w:type="dxa" w:w="100"/>
+              <w:bottom w:type="dxa" w:w="60"/>
+              <w:right w:type="dxa" w:w="100"/>
+            </w:tcMar>
+          </w:tcPr>
+          <w:p>
+            <w:r>
+              <w:rPr>
+                <w:sz w:val="18"/>
+                <w:szCs w:val="18"/>
+              </w:rPr>
+              <w:t xml:space="preserve">출원일</w:t>
+            </w:r>
+          </w:p>
+        </w:tc>
+        <w:tc>
+          <w:tcPr>
+            <w:tcW w:type="dxa" w:w="1872"/>
+            <w:tcBorders>
+              <w:top w:val="single" w:color="BBBBBB" w:sz="1"/>
+              <w:left w:val="single" w:color="BBBBBB" w:sz="1"/>
+              <w:bottom w:val="single" w:color="BBBBBB" w:sz="1"/>
+              <w:right w:val="single" w:color="BBBBBB" w:sz="1"/>
+            </w:tcBorders>
+            <w:shd w:fill="FFFFFF" w:val="clear"/>
+            <w:tcMar>
+              <w:top w:type="dxa" w:w="60"/>
+              <w:left w:type="dxa" w:w="100"/>
+              <w:bottom w:type="dxa" w:w="60"/>
+              <w:right w:type="dxa" w:w="100"/>
+            </w:tcMar>
+          </w:tcPr>
+          <w:p>
+            <w:r>
+              <w:rPr>
+                <w:sz w:val="18"/>
+                <w:szCs w:val="18"/>
+              </w:rPr>
+              <w:t xml:space="preserve">2043-01-19  (출원일+20년; PTA/PTE 미반영)</w:t>
+            </w:r>
+          </w:p>
+        </w:tc>
+      </w:tr>
+      <w:tr>
+        <w:tc>
+          <w:tcPr>
+            <w:tcW w:type="dxa" w:w="1872"/>
+            <w:tcBorders>
+              <w:top w:val="single" w:color="BBBBBB" w:sz="1"/>
+              <w:left w:val="single" w:color="BBBBBB" w:sz="1"/>
+              <w:bottom w:val="single" w:color="BBBBBB" w:sz="1"/>
+              <w:right w:val="single" w:color="BBBBBB" w:sz="1"/>
+            </w:tcBorders>
+            <w:shd w:fill="FFFFFF" w:val="clear"/>
+            <w:tcMar>
+              <w:top w:type="dxa" w:w="60"/>
+              <w:left w:type="dxa" w:w="100"/>
+              <w:bottom w:type="dxa" w:w="60"/>
+              <w:right w:type="dxa" w:w="100"/>
+            </w:tcMar>
+          </w:tcPr>
+          <w:p>
+            <w:r>
+              <w:rPr>
+                <w:sz w:val="18"/>
+                <w:szCs w:val="18"/>
+              </w:rPr>
+              <w:t xml:space="preserve">WO2023212432A1</w:t>
+            </w:r>
+          </w:p>
+        </w:tc>
+        <w:tc>
+          <w:tcPr>
+            <w:tcW w:type="dxa" w:w="1872"/>
+            <w:tcBorders>
+              <w:top w:val="single" w:color="BBBBBB" w:sz="1"/>
+              <w:left w:val="single" w:color="BBBBBB" w:sz="1"/>
+              <w:bottom w:val="single" w:color="BBBBBB" w:sz="1"/>
+              <w:right w:val="single" w:color="BBBBBB" w:sz="1"/>
+            </w:tcBorders>
+            <w:shd w:fill="FFFFFF" w:val="clear"/>
+            <w:tcMar>
+              <w:top w:type="dxa" w:w="60"/>
+              <w:left w:type="dxa" w:w="100"/>
+              <w:bottom w:type="dxa" w:w="60"/>
+              <w:right w:type="dxa" w:w="100"/>
+            </w:tcMar>
+          </w:tcPr>
+          <w:p>
+            <w:r>
+              <w:rPr>
+                <w:sz w:val="18"/>
+                <w:szCs w:val="18"/>
+              </w:rPr>
+              <w:t xml:space="preserve">오귀속/무관</w:t>
+            </w:r>
+          </w:p>
+        </w:tc>
+        <w:tc>
+          <w:tcPr>
+            <w:tcW w:type="dxa" w:w="1872"/>
+            <w:tcBorders>
+              <w:top w:val="single" w:color="BBBBBB" w:sz="1"/>
+              <w:left w:val="single" w:color="BBBBBB" w:sz="1"/>
+              <w:bottom w:val="single" w:color="BBBBBB" w:sz="1"/>
+              <w:right w:val="single" w:color="BBBBBB" w:sz="1"/>
+            </w:tcBorders>
+            <w:shd w:fill="FFFFFF" w:val="clear"/>
+            <w:tcMar>
+              <w:top w:type="dxa" w:w="60"/>
+              <w:left w:type="dxa" w:w="100"/>
+              <w:bottom w:type="dxa" w:w="60"/>
+              <w:right w:type="dxa" w:w="100"/>
+            </w:tcMar>
+          </w:tcPr>
+          <w:p>
+            <w:r>
+              <w:rPr>
+                <w:sz w:val="18"/>
+                <w:szCs w:val="18"/>
+              </w:rPr>
+              <w:t xml:space="preserve">2022-04-26</w:t>
+            </w:r>
+          </w:p>
+        </w:tc>
+        <w:tc>
+          <w:tcPr>
+            <w:tcW w:type="dxa" w:w="1872"/>
+            <w:tcBorders>
+              <w:top w:val="single" w:color="BBBBBB" w:sz="1"/>
+              <w:left w:val="single" w:color="BBBBBB" w:sz="1"/>
+              <w:bottom w:val="single" w:color="BBBBBB" w:sz="1"/>
+              <w:right w:val="single" w:color="BBBBBB" w:sz="1"/>
+            </w:tcBorders>
+            <w:shd w:fill="FFFFFF" w:val="clear"/>
+            <w:tcMar>
+              <w:top w:type="dxa" w:w="60"/>
+              <w:left w:type="dxa" w:w="100"/>
+              <w:bottom w:type="dxa" w:w="60"/>
+              <w:right w:type="dxa" w:w="100"/>
+            </w:tcMar>
+          </w:tcPr>
+          <w:p>
+            <w:r>
+              <w:rPr>
+                <w:sz w:val="18"/>
+                <w:szCs w:val="18"/>
+              </w:rPr>
+              <w:t xml:space="preserve">우선일</w:t>
+            </w:r>
+          </w:p>
+        </w:tc>
+        <w:tc>
+          <w:tcPr>
+            <w:tcW w:type="dxa" w:w="1872"/>
+            <w:tcBorders>
+              <w:top w:val="single" w:color="BBBBBB" w:sz="1"/>
+              <w:left w:val="single" w:color="BBBBBB" w:sz="1"/>
+              <w:bottom w:val="single" w:color="BBBBBB" w:sz="1"/>
+              <w:right w:val="single" w:color="BBBBBB" w:sz="1"/>
+            </w:tcBorders>
+            <w:shd w:fill="FFFFFF" w:val="clear"/>
+            <w:tcMar>
+              <w:top w:type="dxa" w:w="60"/>
+              <w:left w:type="dxa" w:w="100"/>
+              <w:bottom w:type="dxa" w:w="60"/>
+              <w:right w:type="dxa" w:w="100"/>
+            </w:tcMar>
+          </w:tcPr>
+          <w:p>
+            <w:r>
+              <w:rPr>
+                <w:sz w:val="18"/>
+                <w:szCs w:val="18"/>
+              </w:rPr>
+              <w:t xml:space="preserve">2042-04-26  (우선일+20년; PTA/PTE 미반영)</w:t>
+            </w:r>
+          </w:p>
+        </w:tc>
+      </w:tr>
+      <w:tr>
+        <w:tc>
+          <w:tcPr>
+            <w:tcW w:type="dxa" w:w="1872"/>
+            <w:tcBorders>
+              <w:top w:val="single" w:color="BBBBBB" w:sz="1"/>
+              <w:left w:val="single" w:color="BBBBBB" w:sz="1"/>
+              <w:bottom w:val="single" w:color="BBBBBB" w:sz="1"/>
+              <w:right w:val="single" w:color="BBBBBB" w:sz="1"/>
+            </w:tcBorders>
+            <w:shd w:fill="FFFFFF" w:val="clear"/>
+            <w:tcMar>
+              <w:top w:type="dxa" w:w="60"/>
+              <w:left w:type="dxa" w:w="100"/>
+              <w:bottom w:type="dxa" w:w="60"/>
+              <w:right w:type="dxa" w:w="100"/>
+            </w:tcMar>
+          </w:tcPr>
+          <w:p>
+            <w:r>
+              <w:rPr>
+                <w:sz w:val="18"/>
+                <w:szCs w:val="18"/>
+              </w:rPr>
+              <w:t xml:space="preserve">WO2023288019A2</w:t>
+            </w:r>
+          </w:p>
+        </w:tc>
+        <w:tc>
+          <w:tcPr>
+            <w:tcW w:type="dxa" w:w="1872"/>
+            <w:tcBorders>
+              <w:top w:val="single" w:color="BBBBBB" w:sz="1"/>
+              <w:left w:val="single" w:color="BBBBBB" w:sz="1"/>
+              <w:bottom w:val="single" w:color="BBBBBB" w:sz="1"/>
+              <w:right w:val="single" w:color="BBBBBB" w:sz="1"/>
+            </w:tcBorders>
+            <w:shd w:fill="FFFFFF" w:val="clear"/>
+            <w:tcMar>
+              <w:top w:type="dxa" w:w="60"/>
+              <w:left w:type="dxa" w:w="100"/>
+              <w:bottom w:type="dxa" w:w="60"/>
+              <w:right w:type="dxa" w:w="100"/>
+            </w:tcMar>
+          </w:tcPr>
+          <w:p>
+            <w:r>
+              <w:rPr>
+                <w:sz w:val="18"/>
+                <w:szCs w:val="18"/>
+              </w:rPr>
+              <w:t xml:space="preserve">진짜패밀리</w:t>
+            </w:r>
+          </w:p>
+        </w:tc>
+        <w:tc>
+          <w:tcPr>
+            <w:tcW w:type="dxa" w:w="1872"/>
+            <w:tcBorders>
+              <w:top w:val="single" w:color="BBBBBB" w:sz="1"/>
+              <w:left w:val="single" w:color="BBBBBB" w:sz="1"/>
+              <w:bottom w:val="single" w:color="BBBBBB" w:sz="1"/>
+              <w:right w:val="single" w:color="BBBBBB" w:sz="1"/>
+            </w:tcBorders>
+            <w:shd w:fill="FFFFFF" w:val="clear"/>
+            <w:tcMar>
+              <w:top w:type="dxa" w:w="60"/>
+              <w:left w:type="dxa" w:w="100"/>
+              <w:bottom w:type="dxa" w:w="60"/>
+              <w:right w:type="dxa" w:w="100"/>
+            </w:tcMar>
+          </w:tcPr>
+          <w:p>
+            <w:r>
+              <w:rPr>
+                <w:sz w:val="18"/>
+                <w:szCs w:val="18"/>
+              </w:rPr>
+              <w:t xml:space="preserve">2021-07-14</w:t>
+            </w:r>
+          </w:p>
+        </w:tc>
+        <w:tc>
+          <w:tcPr>
+            <w:tcW w:type="dxa" w:w="1872"/>
+            <w:tcBorders>
+              <w:top w:val="single" w:color="BBBBBB" w:sz="1"/>
+              <w:left w:val="single" w:color="BBBBBB" w:sz="1"/>
+              <w:bottom w:val="single" w:color="BBBBBB" w:sz="1"/>
+              <w:right w:val="single" w:color="BBBBBB" w:sz="1"/>
+            </w:tcBorders>
+            <w:shd w:fill="FFFFFF" w:val="clear"/>
+            <w:tcMar>
+              <w:top w:type="dxa" w:w="60"/>
+              <w:left w:type="dxa" w:w="100"/>
+              <w:bottom w:type="dxa" w:w="60"/>
+              <w:right w:type="dxa" w:w="100"/>
+            </w:tcMar>
+          </w:tcPr>
+          <w:p>
+            <w:r>
+              <w:rPr>
+                <w:sz w:val="18"/>
+                <w:szCs w:val="18"/>
+              </w:rPr>
+              <w:t xml:space="preserve">우선일</w:t>
+            </w:r>
+          </w:p>
+        </w:tc>
+        <w:tc>
+          <w:tcPr>
+            <w:tcW w:type="dxa" w:w="1872"/>
+            <w:tcBorders>
+              <w:top w:val="single" w:color="BBBBBB" w:sz="1"/>
+              <w:left w:val="single" w:color="BBBBBB" w:sz="1"/>
+              <w:bottom w:val="single" w:color="BBBBBB" w:sz="1"/>
+              <w:right w:val="single" w:color="BBBBBB" w:sz="1"/>
+            </w:tcBorders>
+            <w:shd w:fill="FFFFFF" w:val="clear"/>
+            <w:tcMar>
+              <w:top w:type="dxa" w:w="60"/>
+              <w:left w:type="dxa" w:w="100"/>
+              <w:bottom w:type="dxa" w:w="60"/>
+              <w:right w:type="dxa" w:w="100"/>
+            </w:tcMar>
+          </w:tcPr>
+          <w:p>
+            <w:r>
+              <w:rPr>
+                <w:sz w:val="18"/>
+                <w:szCs w:val="18"/>
+              </w:rPr>
+              <w:t xml:space="preserve">2041-07-14  (우선일+20년; PTA/PTE 미반영)</w:t>
+            </w:r>
+          </w:p>
+        </w:tc>
+      </w:tr>
+      <w:tr>
+        <w:tc>
+          <w:tcPr>
+            <w:tcW w:type="dxa" w:w="1872"/>
+            <w:tcBorders>
+              <w:top w:val="single" w:color="BBBBBB" w:sz="1"/>
+              <w:left w:val="single" w:color="BBBBBB" w:sz="1"/>
+              <w:bottom w:val="single" w:color="BBBBBB" w:sz="1"/>
+              <w:right w:val="single" w:color="BBBBBB" w:sz="1"/>
+            </w:tcBorders>
+            <w:shd w:fill="FFFFFF" w:val="clear"/>
+            <w:tcMar>
+              <w:top w:type="dxa" w:w="60"/>
+              <w:left w:type="dxa" w:w="100"/>
+              <w:bottom w:type="dxa" w:w="60"/>
+              <w:right w:type="dxa" w:w="100"/>
+            </w:tcMar>
+          </w:tcPr>
+          <w:p>
+            <w:r>
+              <w:rPr>
+                <w:sz w:val="18"/>
+                <w:szCs w:val="18"/>
+              </w:rPr>
+              <w:t xml:space="preserve">WO2024026471A1</w:t>
+            </w:r>
+          </w:p>
+        </w:tc>
+        <w:tc>
+          <w:tcPr>
+            <w:tcW w:type="dxa" w:w="1872"/>
+            <w:tcBorders>
+              <w:top w:val="single" w:color="BBBBBB" w:sz="1"/>
+              <w:left w:val="single" w:color="BBBBBB" w:sz="1"/>
+              <w:bottom w:val="single" w:color="BBBBBB" w:sz="1"/>
+              <w:right w:val="single" w:color="BBBBBB" w:sz="1"/>
+            </w:tcBorders>
+            <w:shd w:fill="FFFFFF" w:val="clear"/>
+            <w:tcMar>
+              <w:top w:type="dxa" w:w="60"/>
+              <w:left w:type="dxa" w:w="100"/>
+              <w:bottom w:type="dxa" w:w="60"/>
+              <w:right w:type="dxa" w:w="100"/>
+            </w:tcMar>
+          </w:tcPr>
+          <w:p>
+            <w:r>
+              <w:rPr>
+                <w:sz w:val="18"/>
+                <w:szCs w:val="18"/>
+              </w:rPr>
+              <w:t xml:space="preserve">오귀속/무관</w:t>
+            </w:r>
+          </w:p>
+        </w:tc>
+        <w:tc>
+          <w:tcPr>
+            <w:tcW w:type="dxa" w:w="1872"/>
+            <w:tcBorders>
+              <w:top w:val="single" w:color="BBBBBB" w:sz="1"/>
+              <w:left w:val="single" w:color="BBBBBB" w:sz="1"/>
+              <w:bottom w:val="single" w:color="BBBBBB" w:sz="1"/>
+              <w:right w:val="single" w:color="BBBBBB" w:sz="1"/>
+            </w:tcBorders>
+            <w:shd w:fill="FFFFFF" w:val="clear"/>
+            <w:tcMar>
+              <w:top w:type="dxa" w:w="60"/>
+              <w:left w:type="dxa" w:w="100"/>
+              <w:bottom w:type="dxa" w:w="60"/>
+              <w:right w:type="dxa" w:w="100"/>
+            </w:tcMar>
+          </w:tcPr>
+          <w:p>
+            <w:r>
+              <w:rPr>
+                <w:sz w:val="18"/>
+                <w:szCs w:val="18"/>
+              </w:rPr>
+              <w:t xml:space="preserve">2022-07-29</w:t>
+            </w:r>
+          </w:p>
+        </w:tc>
+        <w:tc>
+          <w:tcPr>
+            <w:tcW w:type="dxa" w:w="1872"/>
+            <w:tcBorders>
+              <w:top w:val="single" w:color="BBBBBB" w:sz="1"/>
+              <w:left w:val="single" w:color="BBBBBB" w:sz="1"/>
+              <w:bottom w:val="single" w:color="BBBBBB" w:sz="1"/>
+              <w:right w:val="single" w:color="BBBBBB" w:sz="1"/>
+            </w:tcBorders>
+            <w:shd w:fill="FFFFFF" w:val="clear"/>
+            <w:tcMar>
+              <w:top w:type="dxa" w:w="60"/>
+              <w:left w:type="dxa" w:w="100"/>
+              <w:bottom w:type="dxa" w:w="60"/>
+              <w:right w:type="dxa" w:w="100"/>
+            </w:tcMar>
+          </w:tcPr>
+          <w:p>
+            <w:r>
+              <w:rPr>
+                <w:sz w:val="18"/>
+                <w:szCs w:val="18"/>
+              </w:rPr>
+              <w:t xml:space="preserve">우선일</w:t>
+            </w:r>
+          </w:p>
+        </w:tc>
+        <w:tc>
+          <w:tcPr>
+            <w:tcW w:type="dxa" w:w="1872"/>
+            <w:tcBorders>
+              <w:top w:val="single" w:color="BBBBBB" w:sz="1"/>
+              <w:left w:val="single" w:color="BBBBBB" w:sz="1"/>
+              <w:bottom w:val="single" w:color="BBBBBB" w:sz="1"/>
+              <w:right w:val="single" w:color="BBBBBB" w:sz="1"/>
+            </w:tcBorders>
+            <w:shd w:fill="FFFFFF" w:val="clear"/>
+            <w:tcMar>
+              <w:top w:type="dxa" w:w="60"/>
+              <w:left w:type="dxa" w:w="100"/>
+              <w:bottom w:type="dxa" w:w="60"/>
+              <w:right w:type="dxa" w:w="100"/>
+            </w:tcMar>
+          </w:tcPr>
+          <w:p>
+            <w:r>
+              <w:rPr>
+                <w:sz w:val="18"/>
+                <w:szCs w:val="18"/>
+              </w:rPr>
+              <w:t xml:space="preserve">2042-07-29  (우선일+20년; PTA/PTE 미반영)</w:t>
+            </w:r>
+          </w:p>
+        </w:tc>
+      </w:tr>
+      <w:tr>
+        <w:tc>
+          <w:tcPr>
+            <w:tcW w:type="dxa" w:w="1872"/>
+            <w:tcBorders>
+              <w:top w:val="single" w:color="BBBBBB" w:sz="1"/>
+              <w:left w:val="single" w:color="BBBBBB" w:sz="1"/>
+              <w:bottom w:val="single" w:color="BBBBBB" w:sz="1"/>
+              <w:right w:val="single" w:color="BBBBBB" w:sz="1"/>
+            </w:tcBorders>
+            <w:shd w:fill="FFFFFF" w:val="clear"/>
+            <w:tcMar>
+              <w:top w:type="dxa" w:w="60"/>
+              <w:left w:type="dxa" w:w="100"/>
+              <w:bottom w:type="dxa" w:w="60"/>
+              <w:right w:type="dxa" w:w="100"/>
+            </w:tcMar>
+          </w:tcPr>
+          <w:p>
+            <w:r>
+              <w:rPr>
+                <w:sz w:val="18"/>
+                <w:szCs w:val="18"/>
+              </w:rPr>
+              <w:t xml:space="preserve">WO2024026472A1</w:t>
+            </w:r>
+          </w:p>
+        </w:tc>
+        <w:tc>
+          <w:tcPr>
+            <w:tcW w:type="dxa" w:w="1872"/>
+            <w:tcBorders>
+              <w:top w:val="single" w:color="BBBBBB" w:sz="1"/>
+              <w:left w:val="single" w:color="BBBBBB" w:sz="1"/>
+              <w:bottom w:val="single" w:color="BBBBBB" w:sz="1"/>
+              <w:right w:val="single" w:color="BBBBBB" w:sz="1"/>
+            </w:tcBorders>
+            <w:shd w:fill="FFFFFF" w:val="clear"/>
+            <w:tcMar>
+              <w:top w:type="dxa" w:w="60"/>
+              <w:left w:type="dxa" w:w="100"/>
+              <w:bottom w:type="dxa" w:w="60"/>
+              <w:right w:type="dxa" w:w="100"/>
+            </w:tcMar>
+          </w:tcPr>
+          <w:p>
+            <w:r>
+              <w:rPr>
+                <w:sz w:val="18"/>
+                <w:szCs w:val="18"/>
+              </w:rPr>
+              <w:t xml:space="preserve">오귀속/무관</w:t>
+            </w:r>
+          </w:p>
+        </w:tc>
+        <w:tc>
+          <w:tcPr>
+            <w:tcW w:type="dxa" w:w="1872"/>
+            <w:tcBorders>
+              <w:top w:val="single" w:color="BBBBBB" w:sz="1"/>
+              <w:left w:val="single" w:color="BBBBBB" w:sz="1"/>
+              <w:bottom w:val="single" w:color="BBBBBB" w:sz="1"/>
+              <w:right w:val="single" w:color="BBBBBB" w:sz="1"/>
+            </w:tcBorders>
+            <w:shd w:fill="FFFFFF" w:val="clear"/>
+            <w:tcMar>
+              <w:top w:type="dxa" w:w="60"/>
+              <w:left w:type="dxa" w:w="100"/>
+              <w:bottom w:type="dxa" w:w="60"/>
+              <w:right w:type="dxa" w:w="100"/>
+            </w:tcMar>
+          </w:tcPr>
+          <w:p>
+            <w:r>
+              <w:rPr>
+                <w:sz w:val="18"/>
+                <w:szCs w:val="18"/>
+              </w:rPr>
+              <w:t xml:space="preserve">2022-07-29</w:t>
+            </w:r>
+          </w:p>
+        </w:tc>
+        <w:tc>
+          <w:tcPr>
+            <w:tcW w:type="dxa" w:w="1872"/>
+            <w:tcBorders>
+              <w:top w:val="single" w:color="BBBBBB" w:sz="1"/>
+              <w:left w:val="single" w:color="BBBBBB" w:sz="1"/>
+              <w:bottom w:val="single" w:color="BBBBBB" w:sz="1"/>
+              <w:right w:val="single" w:color="BBBBBB" w:sz="1"/>
+            </w:tcBorders>
+            <w:shd w:fill="FFFFFF" w:val="clear"/>
+            <w:tcMar>
+              <w:top w:type="dxa" w:w="60"/>
+              <w:left w:type="dxa" w:w="100"/>
+              <w:bottom w:type="dxa" w:w="60"/>
+              <w:right w:type="dxa" w:w="100"/>
+            </w:tcMar>
+          </w:tcPr>
+          <w:p>
+            <w:r>
+              <w:rPr>
+                <w:sz w:val="18"/>
+                <w:szCs w:val="18"/>
+              </w:rPr>
+              <w:t xml:space="preserve">우선일</w:t>
+            </w:r>
+          </w:p>
+        </w:tc>
+        <w:tc>
+          <w:tcPr>
+            <w:tcW w:type="dxa" w:w="1872"/>
+            <w:tcBorders>
+              <w:top w:val="single" w:color="BBBBBB" w:sz="1"/>
+              <w:left w:val="single" w:color="BBBBBB" w:sz="1"/>
+              <w:bottom w:val="single" w:color="BBBBBB" w:sz="1"/>
+              <w:right w:val="single" w:color="BBBBBB" w:sz="1"/>
+            </w:tcBorders>
+            <w:shd w:fill="FFFFFF" w:val="clear"/>
+            <w:tcMar>
+              <w:top w:type="dxa" w:w="60"/>
+              <w:left w:type="dxa" w:w="100"/>
+              <w:bottom w:type="dxa" w:w="60"/>
+              <w:right w:type="dxa" w:w="100"/>
+            </w:tcMar>
+          </w:tcPr>
+          <w:p>
+            <w:r>
+              <w:rPr>
+                <w:sz w:val="18"/>
+                <w:szCs w:val="18"/>
+              </w:rPr>
+              <w:t xml:space="preserve">2042-07-29  (우선일+20년; PTA/PTE 미반영)</w:t>
+            </w:r>
+          </w:p>
+        </w:tc>
+      </w:tr>
+      <w:tr>
+        <w:tc>
+          <w:tcPr>
+            <w:tcW w:type="dxa" w:w="1872"/>
+            <w:tcBorders>
+              <w:top w:val="single" w:color="BBBBBB" w:sz="1"/>
+              <w:left w:val="single" w:color="BBBBBB" w:sz="1"/>
+              <w:bottom w:val="single" w:color="BBBBBB" w:sz="1"/>
+              <w:right w:val="single" w:color="BBBBBB" w:sz="1"/>
+            </w:tcBorders>
+            <w:shd w:fill="FFFFFF" w:val="clear"/>
+            <w:tcMar>
+              <w:top w:type="dxa" w:w="60"/>
+              <w:left w:type="dxa" w:w="100"/>
+              <w:bottom w:type="dxa" w:w="60"/>
+              <w:right w:type="dxa" w:w="100"/>
+            </w:tcMar>
+          </w:tcPr>
+          <w:p>
+            <w:r>
+              <w:rPr>
+                <w:sz w:val="18"/>
+                <w:szCs w:val="18"/>
+              </w:rPr>
+              <w:t xml:space="preserve">WO2024155552A1</w:t>
+            </w:r>
+          </w:p>
+        </w:tc>
+        <w:tc>
+          <w:tcPr>
+            <w:tcW w:type="dxa" w:w="1872"/>
+            <w:tcBorders>
+              <w:top w:val="single" w:color="BBBBBB" w:sz="1"/>
+              <w:left w:val="single" w:color="BBBBBB" w:sz="1"/>
+              <w:bottom w:val="single" w:color="BBBBBB" w:sz="1"/>
+              <w:right w:val="single" w:color="BBBBBB" w:sz="1"/>
+            </w:tcBorders>
+            <w:shd w:fill="FFFFFF" w:val="clear"/>
+            <w:tcMar>
+              <w:top w:type="dxa" w:w="60"/>
+              <w:left w:type="dxa" w:w="100"/>
+              <w:bottom w:type="dxa" w:w="60"/>
+              <w:right w:type="dxa" w:w="100"/>
+            </w:tcMar>
+          </w:tcPr>
+          <w:p>
+            <w:r>
+              <w:rPr>
+                <w:sz w:val="18"/>
+                <w:szCs w:val="18"/>
+              </w:rPr>
+              <w:t xml:space="preserve">진짜패밀리</w:t>
+            </w:r>
+          </w:p>
+        </w:tc>
+        <w:tc>
+          <w:tcPr>
+            <w:tcW w:type="dxa" w:w="1872"/>
+            <w:tcBorders>
+              <w:top w:val="single" w:color="BBBBBB" w:sz="1"/>
+              <w:left w:val="single" w:color="BBBBBB" w:sz="1"/>
+              <w:bottom w:val="single" w:color="BBBBBB" w:sz="1"/>
+              <w:right w:val="single" w:color="BBBBBB" w:sz="1"/>
+            </w:tcBorders>
+            <w:shd w:fill="FFFFFF" w:val="clear"/>
+            <w:tcMar>
+              <w:top w:type="dxa" w:w="60"/>
+              <w:left w:type="dxa" w:w="100"/>
+              <w:bottom w:type="dxa" w:w="60"/>
+              <w:right w:type="dxa" w:w="100"/>
+            </w:tcMar>
+          </w:tcPr>
+          <w:p>
+            <w:r>
+              <w:rPr>
+                <w:sz w:val="18"/>
+                <w:szCs w:val="18"/>
+              </w:rPr>
+              <w:t xml:space="preserve">2023-01-16</w:t>
+            </w:r>
+          </w:p>
+        </w:tc>
+        <w:tc>
+          <w:tcPr>
+            <w:tcW w:type="dxa" w:w="1872"/>
+            <w:tcBorders>
+              <w:top w:val="single" w:color="BBBBBB" w:sz="1"/>
+              <w:left w:val="single" w:color="BBBBBB" w:sz="1"/>
+              <w:bottom w:val="single" w:color="BBBBBB" w:sz="1"/>
+              <w:right w:val="single" w:color="BBBBBB" w:sz="1"/>
+            </w:tcBorders>
+            <w:shd w:fill="FFFFFF" w:val="clear"/>
+            <w:tcMar>
+              <w:top w:type="dxa" w:w="60"/>
+              <w:left w:type="dxa" w:w="100"/>
+              <w:bottom w:type="dxa" w:w="60"/>
+              <w:right w:type="dxa" w:w="100"/>
+            </w:tcMar>
+          </w:tcPr>
+          <w:p>
+            <w:r>
+              <w:rPr>
+                <w:sz w:val="18"/>
+                <w:szCs w:val="18"/>
+              </w:rPr>
+              <w:t xml:space="preserve">우선일</w:t>
+            </w:r>
+          </w:p>
+        </w:tc>
+        <w:tc>
+          <w:tcPr>
+            <w:tcW w:type="dxa" w:w="1872"/>
+            <w:tcBorders>
+              <w:top w:val="single" w:color="BBBBBB" w:sz="1"/>
+              <w:left w:val="single" w:color="BBBBBB" w:sz="1"/>
+              <w:bottom w:val="single" w:color="BBBBBB" w:sz="1"/>
+              <w:right w:val="single" w:color="BBBBBB" w:sz="1"/>
+            </w:tcBorders>
+            <w:shd w:fill="FFFFFF" w:val="clear"/>
+            <w:tcMar>
+              <w:top w:type="dxa" w:w="60"/>
+              <w:left w:type="dxa" w:w="100"/>
+              <w:bottom w:type="dxa" w:w="60"/>
+              <w:right w:type="dxa" w:w="100"/>
+            </w:tcMar>
+          </w:tcPr>
+          <w:p>
+            <w:r>
+              <w:rPr>
+                <w:sz w:val="18"/>
+                <w:szCs w:val="18"/>
+              </w:rPr>
+              <w:t xml:space="preserve">2043-01-16  (우선일+20년; PTA/PTE 미반영)</w:t>
+            </w:r>
+          </w:p>
+        </w:tc>
+      </w:tr>
+    </w:tbl>
+    <w:p>
+      <w:pPr>
+        <w:spacing w:after="80"/>
+      </w:pPr>
+    </w:p>
+    <w:p>
+      <w:pPr>
+        <w:spacing w:after="60"/>
+      </w:pPr>
+    </w:p>
+    <w:p>
+      <w:pPr>
+        <w:spacing w:after="60"/>
+      </w:pPr>
+      <w:r>
+        <w:rPr>
+          <w:b/>
+          <w:bCs/>
+        </w:rPr>
+        <w:t xml:space="preserve">핵심:</w:t>
+      </w:r>
+      <w:r>
+        <w:t xml:space="preserve"> icotrokinra 물질·조성물 특허 </w:t>
+      </w:r>
+      <w:r>
+        <w:rPr>
+          <w:b/>
+          <w:bCs/>
+        </w:rPr>
+        <w:t xml:space="preserve">US11939361B2</w:t>
+      </w:r>
+      <w:r>
+        <w:t xml:space="preserve"> 기본존속기간 추정 </w:t>
+      </w:r>
+      <w:r>
+        <w:rPr>
+          <w:b/>
+          <w:bCs/>
+        </w:rPr>
+        <w:t xml:space="preserve">2040-11-20</w:t>
+      </w:r>
+      <w:r>
+        <w:t xml:space="preserve"> — 여기에 PTA(가산)와 신약 PTE(최대 +5년) 가능성을 고려하면 실제 만료는 </w:t>
+      </w:r>
+      <w:r>
+        <w:rPr>
+          <w:b/>
+          <w:bCs/>
+        </w:rPr>
+        <w:t xml:space="preserve">2040년대 중반(~2045)</w:t>
+      </w:r>
+      <w:r>
+        <w:t xml:space="preserve"> 까지 연장될 수 있다. 정확한 만료일은 차단되지 않은 권위 출처(USPTO Patent Center/PEDS, FDA Orange Book)에서 PTA·PTE를 확인해야 확정된다.</w:t>
       </w:r>
     </w:p>
     <w:p>

</xml_diff>